<commit_message>
Updated Document - Added personal details
</commit_message>
<xml_diff>
--- a/Heart_Disease_MLOps_Assignment_Report.docx
+++ b/Heart_Disease_MLOps_Assignment_Report.docx
@@ -1,21 +1,7 @@
 
 <file path=word/document.xml><?xml version="1.0" encoding="utf-8"?>
-<w:document xmlns:wpc="http://schemas.microsoft.com/office/word/2010/wordprocessingCanvas" xmlns:mo="http://schemas.microsoft.com/office/mac/office/2008/main" xmlns:mc="http://schemas.openxmlformats.org/markup-compatibility/2006" xmlns:mv="urn:schemas-microsoft-com:mac:vml" xmlns:o="urn:schemas-microsoft-com:office:office" xmlns:r="http://schemas.openxmlformats.org/officeDocument/2006/relationships" xmlns:m="http://schemas.openxmlformats.org/officeDocument/2006/math" xmlns:v="urn:schemas-microsoft-com:vml" xmlns:wp14="http://schemas.microsoft.com/office/word/2010/wordprocessingDrawing" xmlns:wp="http://schemas.openxmlformats.org/drawingml/2006/wordprocessingDrawing" xmlns:w10="urn:schemas-microsoft-com:office:word" xmlns:w="http://schemas.openxmlformats.org/wordprocessingml/2006/main" xmlns:w14="http://schemas.microsoft.com/office/word/2010/wordml" xmlns:wpg="http://schemas.microsoft.com/office/word/2010/wordprocessingGroup" xmlns:wpi="http://schemas.microsoft.com/office/word/2010/wordprocessingInk" xmlns:wne="http://schemas.microsoft.com/office/word/2006/wordml" xmlns:wps="http://schemas.microsoft.com/office/word/2010/wordprocessingShape" mc:Ignorable="w14 wp14">
+<w:document xmlns:ve="http://schemas.openxmlformats.org/markup-compatibility/2006" xmlns:o="urn:schemas-microsoft-com:office:office" xmlns:r="http://schemas.openxmlformats.org/officeDocument/2006/relationships" xmlns:m="http://schemas.openxmlformats.org/officeDocument/2006/math" xmlns:v="urn:schemas-microsoft-com:vml" xmlns:wp="http://schemas.openxmlformats.org/drawingml/2006/wordprocessingDrawing" xmlns:w10="urn:schemas-microsoft-com:office:word" xmlns:w="http://schemas.openxmlformats.org/wordprocessingml/2006/main" xmlns:wne="http://schemas.microsoft.com/office/word/2006/wordml">
   <w:body>
-    <w:p>
-      <w:pPr>
-        <w:spacing w:before="1500"/>
-        <w:jc w:val="center"/>
-      </w:pPr>
-      <w:r>
-        <w:rPr>
-          <w:b/>
-          <w:color w:val="1F4E79"/>
-          <w:sz w:val="32"/>
-        </w:rPr>
-        <w:t>BITS PILANI</w:t>
-      </w:r>
-    </w:p>
     <w:p>
       <w:pPr>
         <w:spacing w:before="700"/>
@@ -28,6 +14,13 @@
           <w:sz w:val="46"/>
         </w:rPr>
         <w:t>CI/CD AND PRODUCTION DEPLOYMENT</w:t>
+      </w:r>
+      <w:r>
+        <w:rPr>
+          <w:b/>
+          <w:color w:val="1F4E79"/>
+          <w:sz w:val="46"/>
+        </w:rPr>
         <w:br/>
         <w:t>EXPERIMENTAL LEARNING</w:t>
       </w:r>
@@ -62,7 +55,10 @@
         <w:jc w:val="center"/>
       </w:pPr>
       <w:r>
-        <w:t>Student Name: [Enter name]</w:t>
+        <w:t xml:space="preserve">Student Name: </w:t>
+      </w:r>
+      <w:r>
+        <w:t>Adhav Vidyabhushan Prakash</w:t>
       </w:r>
     </w:p>
     <w:p>
@@ -70,7 +66,10 @@
         <w:jc w:val="center"/>
       </w:pPr>
       <w:r>
-        <w:t>Student ID: [Enter ID]</w:t>
+        <w:t xml:space="preserve">Student ID: </w:t>
+      </w:r>
+      <w:r>
+        <w:t>2025AE05438</w:t>
       </w:r>
     </w:p>
     <w:p>
@@ -78,27 +77,30 @@
         <w:jc w:val="center"/>
       </w:pPr>
       <w:r>
-        <w:t>Programme / Course: [Enter course]</w:t>
+        <w:t xml:space="preserve">Submission Date: </w:t>
       </w:r>
-    </w:p>
-    <w:p>
-      <w:pPr>
-        <w:jc w:val="center"/>
-      </w:pPr>
       <w:r>
-        <w:t>Submission Date: [Enter date]</w:t>
+        <w:t>20-Oct-2026</w:t>
       </w:r>
     </w:p>
     <w:p>
       <w:pPr>
         <w:spacing w:before="700"/>
         <w:jc w:val="center"/>
+        <w:rPr>
+          <w:b/>
+        </w:rPr>
       </w:pPr>
       <w:r>
         <w:rPr>
           <w:b/>
         </w:rPr>
         <w:t>GitHub repository</w:t>
+      </w:r>
+      <w:r>
+        <w:rPr>
+          <w:b/>
+        </w:rPr>
         <w:br/>
       </w:r>
       <w:r>
@@ -126,6 +128,7 @@
         <w:pStyle w:val="Heading1"/>
       </w:pPr>
       <w:r>
+        <w:lastRenderedPageBreak/>
         <w:t>1. Executive Summary</w:t>
       </w:r>
     </w:p>
@@ -226,6 +229,7 @@
         <w:pStyle w:val="Heading1"/>
       </w:pPr>
       <w:r>
+        <w:lastRenderedPageBreak/>
         <w:t>2. Dataset Acquisition and EDA</w:t>
       </w:r>
     </w:p>
@@ -304,16 +308,12 @@
         <w:t>Run python src/eda.py and inspect the generated reports/ files.</w:t>
       </w:r>
     </w:p>
-    <w:p>
-      <w:r>
-        <w:t>The final submission should describe the class balance and missingness using the actual generated reports. Do not infer counts that are not supported by those files.</w:t>
-      </w:r>
-    </w:p>
+    <w:p/>
     <w:tbl>
       <w:tblPr>
         <w:tblStyle w:val="TableGrid"/>
-        <w:tblW w:type="auto" w:w="0"/>
-        <w:tblLook w:firstColumn="1" w:firstRow="1" w:lastColumn="0" w:lastRow="0" w:noHBand="0" w:noVBand="1" w:val="04A0"/>
+        <w:tblW w:w="0" w:type="auto"/>
+        <w:tblLook w:val="04A0"/>
       </w:tblPr>
       <w:tblGrid>
         <w:gridCol w:w="10080"/>
@@ -324,36 +324,446 @@
         </w:trPr>
         <w:tc>
           <w:tcPr>
-            <w:tcW w:type="dxa" w:w="10080"/>
+            <w:tcW w:w="10080" w:type="dxa"/>
           </w:tcPr>
           <w:p>
             <w:pPr>
-              <w:jc w:val="center"/>
+              <w:rPr>
+                <w:b/>
+              </w:rPr>
+            </w:pPr>
+          </w:p>
+          <w:p>
+            <w:pPr>
+              <w:rPr>
+                <w:b/>
+              </w:rPr>
             </w:pPr>
             <w:r>
               <w:rPr>
-                <w:i/>
-                <w:color w:val="646464"/>
-                <w:sz w:val="16"/>
+                <w:b/>
               </w:rPr>
-              <w:t>[SCREENSHOT PLACEHOLDER: EDA outputs and missing-value summary]</w:t>
-              <w:br/>
-              <w:t>Replace this box with a genuine screenshot from the project environment.</w:t>
+              <w:t xml:space="preserve">Missing Values : </w:t>
             </w:r>
           </w:p>
+          <w:p>
+            <w:r>
+              <w:br/>
+            </w:r>
+            <w:r>
+              <w:rPr>
+                <w:rFonts w:hint="eastAsia"/>
+                <w:noProof/>
+              </w:rPr>
+              <w:drawing>
+                <wp:inline distT="0" distB="0" distL="0" distR="0">
+                  <wp:extent cx="2117655" cy="1877291"/>
+                  <wp:effectExtent l="19050" t="0" r="0" b="0"/>
+                  <wp:docPr id="7" name="Picture 7"/>
+                  <wp:cNvGraphicFramePr>
+                    <a:graphicFrameLocks xmlns:a="http://schemas.openxmlformats.org/drawingml/2006/main" noChangeAspect="1"/>
+                  </wp:cNvGraphicFramePr>
+                  <a:graphic xmlns:a="http://schemas.openxmlformats.org/drawingml/2006/main">
+                    <a:graphicData uri="http://schemas.openxmlformats.org/drawingml/2006/picture">
+                      <pic:pic xmlns:pic="http://schemas.openxmlformats.org/drawingml/2006/picture">
+                        <pic:nvPicPr>
+                          <pic:cNvPr id="0" name="Picture 7"/>
+                          <pic:cNvPicPr>
+                            <a:picLocks noChangeAspect="1" noChangeArrowheads="1"/>
+                          </pic:cNvPicPr>
+                        </pic:nvPicPr>
+                        <pic:blipFill>
+                          <a:blip r:embed="rId8"/>
+                          <a:srcRect/>
+                          <a:stretch>
+                            <a:fillRect/>
+                          </a:stretch>
+                        </pic:blipFill>
+                        <pic:spPr bwMode="auto">
+                          <a:xfrm>
+                            <a:off x="0" y="0"/>
+                            <a:ext cx="2117558" cy="1877205"/>
+                          </a:xfrm>
+                          <a:prstGeom prst="rect">
+                            <a:avLst/>
+                          </a:prstGeom>
+                          <a:noFill/>
+                          <a:ln w="9525">
+                            <a:noFill/>
+                            <a:miter lim="800000"/>
+                            <a:headEnd/>
+                            <a:tailEnd/>
+                          </a:ln>
+                        </pic:spPr>
+                      </pic:pic>
+                    </a:graphicData>
+                  </a:graphic>
+                </wp:inline>
+              </w:drawing>
+            </w:r>
+          </w:p>
+          <w:p/>
+          <w:p>
+            <w:pPr>
+              <w:rPr>
+                <w:b/>
+              </w:rPr>
+            </w:pPr>
+            <w:r>
+              <w:rPr>
+                <w:b/>
+              </w:rPr>
+              <w:t xml:space="preserve">Class Distribution : </w:t>
+            </w:r>
+          </w:p>
+          <w:p>
+            <w:pPr>
+              <w:rPr>
+                <w:b/>
+              </w:rPr>
+            </w:pPr>
+          </w:p>
+          <w:p>
+            <w:pPr>
+              <w:rPr>
+                <w:b/>
+              </w:rPr>
+            </w:pPr>
+            <w:r>
+              <w:rPr>
+                <w:b/>
+                <w:noProof/>
+              </w:rPr>
+              <w:drawing>
+                <wp:inline distT="0" distB="0" distL="0" distR="0">
+                  <wp:extent cx="1705841" cy="684950"/>
+                  <wp:effectExtent l="19050" t="0" r="8659" b="0"/>
+                  <wp:docPr id="10" name="Picture 10"/>
+                  <wp:cNvGraphicFramePr>
+                    <a:graphicFrameLocks xmlns:a="http://schemas.openxmlformats.org/drawingml/2006/main" noChangeAspect="1"/>
+                  </wp:cNvGraphicFramePr>
+                  <a:graphic xmlns:a="http://schemas.openxmlformats.org/drawingml/2006/main">
+                    <a:graphicData uri="http://schemas.openxmlformats.org/drawingml/2006/picture">
+                      <pic:pic xmlns:pic="http://schemas.openxmlformats.org/drawingml/2006/picture">
+                        <pic:nvPicPr>
+                          <pic:cNvPr id="0" name="Picture 10"/>
+                          <pic:cNvPicPr>
+                            <a:picLocks noChangeAspect="1" noChangeArrowheads="1"/>
+                          </pic:cNvPicPr>
+                        </pic:nvPicPr>
+                        <pic:blipFill>
+                          <a:blip r:embed="rId9"/>
+                          <a:srcRect/>
+                          <a:stretch>
+                            <a:fillRect/>
+                          </a:stretch>
+                        </pic:blipFill>
+                        <pic:spPr bwMode="auto">
+                          <a:xfrm>
+                            <a:off x="0" y="0"/>
+                            <a:ext cx="1705841" cy="684950"/>
+                          </a:xfrm>
+                          <a:prstGeom prst="rect">
+                            <a:avLst/>
+                          </a:prstGeom>
+                          <a:noFill/>
+                          <a:ln w="9525">
+                            <a:noFill/>
+                            <a:miter lim="800000"/>
+                            <a:headEnd/>
+                            <a:tailEnd/>
+                          </a:ln>
+                        </pic:spPr>
+                      </pic:pic>
+                    </a:graphicData>
+                  </a:graphic>
+                </wp:inline>
+              </w:drawing>
+            </w:r>
+          </w:p>
+          <w:p>
+            <w:pPr>
+              <w:rPr>
+                <w:b/>
+              </w:rPr>
+            </w:pPr>
+          </w:p>
+          <w:p>
+            <w:pPr>
+              <w:rPr>
+                <w:b/>
+              </w:rPr>
+            </w:pPr>
+            <w:r>
+              <w:rPr>
+                <w:b/>
+              </w:rPr>
+              <w:t xml:space="preserve">Target Distribution: </w:t>
+            </w:r>
+          </w:p>
+          <w:p>
+            <w:pPr>
+              <w:rPr>
+                <w:b/>
+              </w:rPr>
+            </w:pPr>
+          </w:p>
+          <w:p>
+            <w:pPr>
+              <w:rPr>
+                <w:b/>
+              </w:rPr>
+            </w:pPr>
+            <w:r>
+              <w:rPr>
+                <w:b/>
+                <w:noProof/>
+              </w:rPr>
+              <w:drawing>
+                <wp:inline distT="0" distB="0" distL="0" distR="0">
+                  <wp:extent cx="3090574" cy="2313709"/>
+                  <wp:effectExtent l="19050" t="0" r="0" b="0"/>
+                  <wp:docPr id="13" name="Picture 13"/>
+                  <wp:cNvGraphicFramePr>
+                    <a:graphicFrameLocks xmlns:a="http://schemas.openxmlformats.org/drawingml/2006/main" noChangeAspect="1"/>
+                  </wp:cNvGraphicFramePr>
+                  <a:graphic xmlns:a="http://schemas.openxmlformats.org/drawingml/2006/main">
+                    <a:graphicData uri="http://schemas.openxmlformats.org/drawingml/2006/picture">
+                      <pic:pic xmlns:pic="http://schemas.openxmlformats.org/drawingml/2006/picture">
+                        <pic:nvPicPr>
+                          <pic:cNvPr id="0" name="Picture 13"/>
+                          <pic:cNvPicPr>
+                            <a:picLocks noChangeAspect="1" noChangeArrowheads="1"/>
+                          </pic:cNvPicPr>
+                        </pic:nvPicPr>
+                        <pic:blipFill>
+                          <a:blip r:embed="rId10"/>
+                          <a:srcRect/>
+                          <a:stretch>
+                            <a:fillRect/>
+                          </a:stretch>
+                        </pic:blipFill>
+                        <pic:spPr bwMode="auto">
+                          <a:xfrm>
+                            <a:off x="0" y="0"/>
+                            <a:ext cx="3090499" cy="2313653"/>
+                          </a:xfrm>
+                          <a:prstGeom prst="rect">
+                            <a:avLst/>
+                          </a:prstGeom>
+                          <a:noFill/>
+                          <a:ln w="9525">
+                            <a:noFill/>
+                            <a:miter lim="800000"/>
+                            <a:headEnd/>
+                            <a:tailEnd/>
+                          </a:ln>
+                        </pic:spPr>
+                      </pic:pic>
+                    </a:graphicData>
+                  </a:graphic>
+                </wp:inline>
+              </w:drawing>
+            </w:r>
+          </w:p>
+          <w:p/>
         </w:tc>
       </w:tr>
     </w:tbl>
     <w:p>
+      <w:pPr>
+        <w:rPr>
+          <w:b/>
+        </w:rPr>
+      </w:pPr>
       <w:r>
         <w:br w:type="page"/>
       </w:r>
+      <w:r>
+        <w:rPr>
+          <w:b/>
+        </w:rPr>
+        <w:lastRenderedPageBreak/>
+        <w:t xml:space="preserve">Age Distribution : </w:t>
+      </w:r>
     </w:p>
+    <w:p>
+      <w:pPr>
+        <w:rPr>
+          <w:b/>
+        </w:rPr>
+      </w:pPr>
+    </w:p>
+    <w:p>
+      <w:pPr>
+        <w:rPr>
+          <w:b/>
+        </w:rPr>
+      </w:pPr>
+      <w:r>
+        <w:rPr>
+          <w:rFonts w:hint="eastAsia"/>
+          <w:b/>
+          <w:noProof/>
+        </w:rPr>
+        <w:drawing>
+          <wp:inline distT="0" distB="0" distL="0" distR="0">
+            <wp:extent cx="4164968" cy="3110346"/>
+            <wp:effectExtent l="19050" t="0" r="6982" b="0"/>
+            <wp:docPr id="22" name="Picture 22"/>
+            <wp:cNvGraphicFramePr>
+              <a:graphicFrameLocks xmlns:a="http://schemas.openxmlformats.org/drawingml/2006/main" noChangeAspect="1"/>
+            </wp:cNvGraphicFramePr>
+            <a:graphic xmlns:a="http://schemas.openxmlformats.org/drawingml/2006/main">
+              <a:graphicData uri="http://schemas.openxmlformats.org/drawingml/2006/picture">
+                <pic:pic xmlns:pic="http://schemas.openxmlformats.org/drawingml/2006/picture">
+                  <pic:nvPicPr>
+                    <pic:cNvPr id="0" name="Picture 22"/>
+                    <pic:cNvPicPr>
+                      <a:picLocks noChangeAspect="1" noChangeArrowheads="1"/>
+                    </pic:cNvPicPr>
+                  </pic:nvPicPr>
+                  <pic:blipFill>
+                    <a:blip r:embed="rId11"/>
+                    <a:srcRect/>
+                    <a:stretch>
+                      <a:fillRect/>
+                    </a:stretch>
+                  </pic:blipFill>
+                  <pic:spPr bwMode="auto">
+                    <a:xfrm>
+                      <a:off x="0" y="0"/>
+                      <a:ext cx="4165159" cy="3110489"/>
+                    </a:xfrm>
+                    <a:prstGeom prst="rect">
+                      <a:avLst/>
+                    </a:prstGeom>
+                    <a:noFill/>
+                    <a:ln w="9525">
+                      <a:noFill/>
+                      <a:miter lim="800000"/>
+                      <a:headEnd/>
+                      <a:tailEnd/>
+                    </a:ln>
+                  </pic:spPr>
+                </pic:pic>
+              </a:graphicData>
+            </a:graphic>
+          </wp:inline>
+        </w:drawing>
+      </w:r>
+    </w:p>
+    <w:p>
+      <w:pPr>
+        <w:rPr>
+          <w:b/>
+        </w:rPr>
+      </w:pPr>
+    </w:p>
+    <w:p>
+      <w:r>
+        <w:rPr>
+          <w:b/>
+        </w:rPr>
+        <w:t xml:space="preserve">EDA Summary : </w:t>
+      </w:r>
+      <w:r>
+        <w:rPr>
+          <w:b/>
+        </w:rPr>
+        <w:br/>
+      </w:r>
+      <w:r>
+        <w:rPr>
+          <w:b/>
+        </w:rPr>
+        <w:br/>
+      </w:r>
+      <w:r>
+        <w:rPr>
+          <w:rFonts w:hint="eastAsia"/>
+        </w:rPr>
+        <w:t>,age,sex,cp,trestbps,chol,fbs,restecg,thalach,exang,oldpeak,slope,ca,thal,num,target</w:t>
+      </w:r>
+    </w:p>
+    <w:p>
+      <w:r>
+        <w:rPr>
+          <w:rFonts w:hint="eastAsia"/>
+        </w:rPr>
+        <w:t>count,303.0,303.0,303.0,303.0,303.0,303.0,303.0,303.0,303.0,303.0,303.0,299.0,301.0,303.0,303.0</w:t>
+      </w:r>
+    </w:p>
+    <w:p>
+      <w:r>
+        <w:rPr>
+          <w:rFonts w:hint="eastAsia"/>
+        </w:rPr>
+        <w:t>mean,54.43894389438944,0.6798679867986799,3.1584158415841586,131.68976897689768,246.69306930693068,0.1485148514851485,0.9900990099009901,149.6072607260726,0.32673267326732675,1.0396039603960396,1.6006600660066006,0.6722408026755853,4.73421926910299,0.9372937293729373,0.45874587458745875</w:t>
+      </w:r>
+    </w:p>
+    <w:p>
+      <w:r>
+        <w:rPr>
+          <w:rFonts w:hint="eastAsia"/>
+        </w:rPr>
+        <w:t>std,9.038662442446746,0.46729882777012993,0.9601256119600138,17.59974772958769,51.77691754263704,0.35619787492797644,0.9949712915251782,22.875003276980376,0.46979446452231655,1.1610750220686348,0.6162261453459619,0.9374383177242163,1.939705769378644,1.2285356879701044,0.4991195009875263</w:t>
+      </w:r>
+    </w:p>
+    <w:p>
+      <w:r>
+        <w:rPr>
+          <w:rFonts w:hint="eastAsia"/>
+        </w:rPr>
+        <w:t>min,29.0,0.0,1.0,94.0,126.0,0.0,0.0,71.0,0.0,0.0,1.0,0.0,3.0,0.0,0.0</w:t>
+      </w:r>
+    </w:p>
+    <w:p>
+      <w:r>
+        <w:rPr>
+          <w:rFonts w:hint="eastAsia"/>
+        </w:rPr>
+        <w:t>25%,48.0,0.0,3.0,120.0,211.0,0.0,0.0,133.5,0.0,0.0,1.0,0.0,3.0,0.0,0.0</w:t>
+      </w:r>
+    </w:p>
+    <w:p>
+      <w:r>
+        <w:rPr>
+          <w:rFonts w:hint="eastAsia"/>
+        </w:rPr>
+        <w:t>50%,56.0,1.0,3.0,130.0,241.0,0.0,1.0,153.0,0.0,0.8,2.0,0.0,3.0,0.0,0.0</w:t>
+      </w:r>
+    </w:p>
+    <w:p>
+      <w:r>
+        <w:rPr>
+          <w:rFonts w:hint="eastAsia"/>
+        </w:rPr>
+        <w:t>75%,61.0,1.0,4.0,140.0,275.0,0.0,2.0,166.0,1.0,1.6,2.0,1.0,7.0,2.0,1.0</w:t>
+      </w:r>
+    </w:p>
+    <w:p>
+      <w:r>
+        <w:rPr>
+          <w:rFonts w:hint="eastAsia"/>
+        </w:rPr>
+        <w:t>max,77.0,1.0,4.0,200.0,564.0,1.0,2.0,202.0,1.0,6.2,3.0,3.0,7.0,4.0,1.0</w:t>
+      </w:r>
+    </w:p>
+    <w:p/>
+    <w:p/>
+    <w:p/>
+    <w:p/>
+    <w:p/>
+    <w:p/>
+    <w:p/>
+    <w:p/>
     <w:p>
       <w:pPr>
         <w:pStyle w:val="Heading1"/>
       </w:pPr>
       <w:r>
+        <w:lastRenderedPageBreak/>
         <w:t>3. Feature Engineering and Model Development</w:t>
       </w:r>
     </w:p>
@@ -390,10 +800,10 @@
     </w:p>
     <w:tbl>
       <w:tblPr>
-        <w:tblStyle w:val="LightShading-Accent1"/>
-        <w:tblW w:type="auto" w:w="0"/>
+        <w:tblStyle w:val="LightShading-Accent11"/>
+        <w:tblW w:w="0" w:type="auto"/>
         <w:jc w:val="center"/>
-        <w:tblLook w:firstColumn="1" w:firstRow="1" w:lastColumn="0" w:lastRow="0" w:noHBand="0" w:noVBand="1" w:val="04A0"/>
+        <w:tblLook w:val="04A0"/>
       </w:tblPr>
       <w:tblGrid>
         <w:gridCol w:w="3360"/>
@@ -402,16 +812,18 @@
       </w:tblGrid>
       <w:tr>
         <w:trPr>
+          <w:cnfStyle w:val="100000000000"/>
           <w:cantSplit/>
+          <w:jc w:val="center"/>
         </w:trPr>
         <w:tc>
           <w:tcPr>
-            <w:tcW w:type="dxa" w:w="3360"/>
+            <w:cnfStyle w:val="001000000000"/>
+            <w:tcW w:w="3360" w:type="dxa"/>
           </w:tcPr>
           <w:p>
             <w:r>
               <w:rPr>
-                <w:b/>
                 <w:sz w:val="16"/>
               </w:rPr>
               <w:t>Metric</w:t>
@@ -420,12 +832,14 @@
         </w:tc>
         <w:tc>
           <w:tcPr>
-            <w:tcW w:type="dxa" w:w="3360"/>
+            <w:tcW w:w="3360" w:type="dxa"/>
           </w:tcPr>
           <w:p>
+            <w:pPr>
+              <w:cnfStyle w:val="100000000000"/>
+            </w:pPr>
             <w:r>
               <w:rPr>
-                <w:b/>
                 <w:sz w:val="16"/>
               </w:rPr>
               <w:t>Logistic Regression</w:t>
@@ -434,12 +848,14 @@
         </w:tc>
         <w:tc>
           <w:tcPr>
-            <w:tcW w:type="dxa" w:w="3360"/>
+            <w:tcW w:w="3360" w:type="dxa"/>
           </w:tcPr>
           <w:p>
+            <w:pPr>
+              <w:cnfStyle w:val="100000000000"/>
+            </w:pPr>
             <w:r>
               <w:rPr>
-                <w:b/>
                 <w:sz w:val="16"/>
               </w:rPr>
               <w:t>Random Forest</w:t>
@@ -449,11 +865,14 @@
       </w:tr>
       <w:tr>
         <w:trPr>
+          <w:cnfStyle w:val="000000100000"/>
           <w:cantSplit/>
+          <w:jc w:val="center"/>
         </w:trPr>
         <w:tc>
           <w:tcPr>
-            <w:tcW w:type="dxa" w:w="3360"/>
+            <w:cnfStyle w:val="001000000000"/>
+            <w:tcW w:w="3360" w:type="dxa"/>
           </w:tcPr>
           <w:p>
             <w:pPr>
@@ -469,11 +888,12 @@
         </w:tc>
         <w:tc>
           <w:tcPr>
-            <w:tcW w:type="dxa" w:w="3360"/>
+            <w:tcW w:w="3360" w:type="dxa"/>
           </w:tcPr>
           <w:p>
             <w:pPr>
               <w:spacing w:after="0"/>
+              <w:cnfStyle w:val="000000100000"/>
             </w:pPr>
             <w:r>
               <w:rPr>
@@ -485,11 +905,12 @@
         </w:tc>
         <w:tc>
           <w:tcPr>
-            <w:tcW w:type="dxa" w:w="3360"/>
+            <w:tcW w:w="3360" w:type="dxa"/>
           </w:tcPr>
           <w:p>
             <w:pPr>
               <w:spacing w:after="0"/>
+              <w:cnfStyle w:val="000000100000"/>
             </w:pPr>
             <w:r>
               <w:rPr>
@@ -503,10 +924,12 @@
       <w:tr>
         <w:trPr>
           <w:cantSplit/>
+          <w:jc w:val="center"/>
         </w:trPr>
         <w:tc>
           <w:tcPr>
-            <w:tcW w:type="dxa" w:w="3360"/>
+            <w:cnfStyle w:val="001000000000"/>
+            <w:tcW w:w="3360" w:type="dxa"/>
           </w:tcPr>
           <w:p>
             <w:pPr>
@@ -522,11 +945,12 @@
         </w:tc>
         <w:tc>
           <w:tcPr>
-            <w:tcW w:type="dxa" w:w="3360"/>
+            <w:tcW w:w="3360" w:type="dxa"/>
           </w:tcPr>
           <w:p>
             <w:pPr>
               <w:spacing w:after="0"/>
+              <w:cnfStyle w:val="000000000000"/>
             </w:pPr>
             <w:r>
               <w:rPr>
@@ -538,11 +962,12 @@
         </w:tc>
         <w:tc>
           <w:tcPr>
-            <w:tcW w:type="dxa" w:w="3360"/>
+            <w:tcW w:w="3360" w:type="dxa"/>
           </w:tcPr>
           <w:p>
             <w:pPr>
               <w:spacing w:after="0"/>
+              <w:cnfStyle w:val="000000000000"/>
             </w:pPr>
             <w:r>
               <w:rPr>
@@ -555,11 +980,14 @@
       </w:tr>
       <w:tr>
         <w:trPr>
+          <w:cnfStyle w:val="000000100000"/>
           <w:cantSplit/>
+          <w:jc w:val="center"/>
         </w:trPr>
         <w:tc>
           <w:tcPr>
-            <w:tcW w:type="dxa" w:w="3360"/>
+            <w:cnfStyle w:val="001000000000"/>
+            <w:tcW w:w="3360" w:type="dxa"/>
           </w:tcPr>
           <w:p>
             <w:pPr>
@@ -575,11 +1003,12 @@
         </w:tc>
         <w:tc>
           <w:tcPr>
-            <w:tcW w:type="dxa" w:w="3360"/>
+            <w:tcW w:w="3360" w:type="dxa"/>
           </w:tcPr>
           <w:p>
             <w:pPr>
               <w:spacing w:after="0"/>
+              <w:cnfStyle w:val="000000100000"/>
             </w:pPr>
             <w:r>
               <w:rPr>
@@ -591,11 +1020,12 @@
         </w:tc>
         <w:tc>
           <w:tcPr>
-            <w:tcW w:type="dxa" w:w="3360"/>
+            <w:tcW w:w="3360" w:type="dxa"/>
           </w:tcPr>
           <w:p>
             <w:pPr>
               <w:spacing w:after="0"/>
+              <w:cnfStyle w:val="000000100000"/>
             </w:pPr>
             <w:r>
               <w:rPr>
@@ -609,10 +1039,12 @@
       <w:tr>
         <w:trPr>
           <w:cantSplit/>
+          <w:jc w:val="center"/>
         </w:trPr>
         <w:tc>
           <w:tcPr>
-            <w:tcW w:type="dxa" w:w="3360"/>
+            <w:cnfStyle w:val="001000000000"/>
+            <w:tcW w:w="3360" w:type="dxa"/>
           </w:tcPr>
           <w:p>
             <w:pPr>
@@ -628,11 +1060,12 @@
         </w:tc>
         <w:tc>
           <w:tcPr>
-            <w:tcW w:type="dxa" w:w="3360"/>
+            <w:tcW w:w="3360" w:type="dxa"/>
           </w:tcPr>
           <w:p>
             <w:pPr>
               <w:spacing w:after="0"/>
+              <w:cnfStyle w:val="000000000000"/>
             </w:pPr>
             <w:r>
               <w:rPr>
@@ -644,11 +1077,12 @@
         </w:tc>
         <w:tc>
           <w:tcPr>
-            <w:tcW w:type="dxa" w:w="3360"/>
+            <w:tcW w:w="3360" w:type="dxa"/>
           </w:tcPr>
           <w:p>
             <w:pPr>
               <w:spacing w:after="0"/>
+              <w:cnfStyle w:val="000000000000"/>
             </w:pPr>
             <w:r>
               <w:rPr>
@@ -661,11 +1095,14 @@
       </w:tr>
       <w:tr>
         <w:trPr>
+          <w:cnfStyle w:val="000000100000"/>
           <w:cantSplit/>
+          <w:jc w:val="center"/>
         </w:trPr>
         <w:tc>
           <w:tcPr>
-            <w:tcW w:type="dxa" w:w="3360"/>
+            <w:cnfStyle w:val="001000000000"/>
+            <w:tcW w:w="3360" w:type="dxa"/>
           </w:tcPr>
           <w:p>
             <w:pPr>
@@ -681,11 +1118,12 @@
         </w:tc>
         <w:tc>
           <w:tcPr>
-            <w:tcW w:type="dxa" w:w="3360"/>
+            <w:tcW w:w="3360" w:type="dxa"/>
           </w:tcPr>
           <w:p>
             <w:pPr>
               <w:spacing w:after="0"/>
+              <w:cnfStyle w:val="000000100000"/>
             </w:pPr>
             <w:r>
               <w:rPr>
@@ -697,11 +1135,12 @@
         </w:tc>
         <w:tc>
           <w:tcPr>
-            <w:tcW w:type="dxa" w:w="3360"/>
+            <w:tcW w:w="3360" w:type="dxa"/>
           </w:tcPr>
           <w:p>
             <w:pPr>
               <w:spacing w:after="0"/>
+              <w:cnfStyle w:val="000000100000"/>
             </w:pPr>
             <w:r>
               <w:rPr>
@@ -735,8 +1174,8 @@
     <w:tbl>
       <w:tblPr>
         <w:tblStyle w:val="TableGrid"/>
-        <w:tblW w:type="auto" w:w="0"/>
-        <w:tblLook w:firstColumn="1" w:firstRow="1" w:lastColumn="0" w:lastRow="0" w:noHBand="0" w:noVBand="1" w:val="04A0"/>
+        <w:tblW w:w="0" w:type="auto"/>
+        <w:tblLook w:val="04A0"/>
       </w:tblPr>
       <w:tblGrid>
         <w:gridCol w:w="10080"/>
@@ -747,22 +1186,89 @@
         </w:trPr>
         <w:tc>
           <w:tcPr>
-            <w:tcW w:type="dxa" w:w="10080"/>
+            <w:tcW w:w="10080" w:type="dxa"/>
           </w:tcPr>
           <w:p>
             <w:pPr>
-              <w:jc w:val="center"/>
+              <w:rPr>
+                <w:b/>
+                <w:color w:val="000000" w:themeColor="text1"/>
+                <w:sz w:val="16"/>
+              </w:rPr>
             </w:pPr>
             <w:r>
               <w:rPr>
-                <w:i/>
                 <w:color w:val="646464"/>
                 <w:sz w:val="16"/>
               </w:rPr>
-              <w:t>[SCREENSHOT PLACEHOLDER: Model comparison report]</w:t>
-              <w:br/>
-              <w:t>Replace this box with a genuine screenshot from the project environment.</w:t>
+              <w:t>.</w:t>
             </w:r>
+            <w:r>
+              <w:rPr>
+                <w:b/>
+                <w:color w:val="000000" w:themeColor="text1"/>
+                <w:sz w:val="16"/>
+              </w:rPr>
+              <w:t>Model Comparison report</w:t>
+            </w:r>
+          </w:p>
+          <w:p>
+            <w:pPr>
+              <w:rPr>
+                <w:b/>
+                <w:color w:val="000000" w:themeColor="text1"/>
+                <w:sz w:val="16"/>
+              </w:rPr>
+            </w:pPr>
+          </w:p>
+          <w:p>
+            <w:pPr>
+              <w:rPr>
+                <w:color w:val="000000" w:themeColor="text1"/>
+              </w:rPr>
+            </w:pPr>
+            <w:r>
+              <w:rPr>
+                <w:rFonts w:hint="eastAsia"/>
+                <w:color w:val="000000" w:themeColor="text1"/>
+              </w:rPr>
+              <w:t>model,accuracy,precision,recall,f1,roc_auc</w:t>
+            </w:r>
+          </w:p>
+          <w:p>
+            <w:pPr>
+              <w:rPr>
+                <w:color w:val="000000" w:themeColor="text1"/>
+              </w:rPr>
+            </w:pPr>
+            <w:r>
+              <w:rPr>
+                <w:rFonts w:hint="eastAsia"/>
+                <w:color w:val="000000" w:themeColor="text1"/>
+              </w:rPr>
+              <w:t>LogisticRegression,0.8852459016393442,0.8387096774193549,0.9285714285714286,0.8813559322033898,0.9664502164502166</w:t>
+            </w:r>
+          </w:p>
+          <w:p>
+            <w:pPr>
+              <w:rPr>
+                <w:color w:val="000000" w:themeColor="text1"/>
+              </w:rPr>
+            </w:pPr>
+            <w:r>
+              <w:rPr>
+                <w:rFonts w:hint="eastAsia"/>
+                <w:color w:val="000000" w:themeColor="text1"/>
+              </w:rPr>
+              <w:t>RandomForest,0.9016393442622951,0.84375,0.9642857142857143,0.9,0.9502164502164503</w:t>
+            </w:r>
+          </w:p>
+          <w:p>
+            <w:pPr>
+              <w:rPr>
+                <w:color w:val="000000" w:themeColor="text1"/>
+              </w:rPr>
+            </w:pPr>
           </w:p>
         </w:tc>
       </w:tr>
@@ -777,6 +1283,7 @@
         <w:pStyle w:val="Heading1"/>
       </w:pPr>
       <w:r>
+        <w:lastRenderedPageBreak/>
         <w:t>4. MLflow Tracking and Reproducibility</w:t>
       </w:r>
     </w:p>
@@ -876,11 +1383,11 @@
     <w:tbl>
       <w:tblPr>
         <w:tblStyle w:val="TableGrid"/>
-        <w:tblW w:type="auto" w:w="0"/>
-        <w:tblLook w:firstColumn="1" w:firstRow="1" w:lastColumn="0" w:lastRow="0" w:noHBand="0" w:noVBand="1" w:val="04A0"/>
+        <w:tblW w:w="0" w:type="auto"/>
+        <w:tblLook w:val="04A0"/>
       </w:tblPr>
       <w:tblGrid>
-        <w:gridCol w:w="10080"/>
+        <w:gridCol w:w="10296"/>
       </w:tblGrid>
       <w:tr>
         <w:trPr>
@@ -888,7 +1395,7 @@
         </w:trPr>
         <w:tc>
           <w:tcPr>
-            <w:tcW w:type="dxa" w:w="10080"/>
+            <w:tcW w:w="10080" w:type="dxa"/>
           </w:tcPr>
           <w:p>
             <w:pPr>
@@ -896,13 +1403,177 @@
             </w:pPr>
             <w:r>
               <w:rPr>
-                <w:i/>
-                <w:color w:val="646464"/>
-                <w:sz w:val="16"/>
+                <w:rFonts w:hint="eastAsia"/>
+                <w:noProof/>
               </w:rPr>
-              <w:t>[SCREENSHOT PLACEHOLDER: MLflow experiment runs and metrics]</w:t>
-              <w:br/>
-              <w:t>Replace this box with a genuine screenshot from the project environment.</w:t>
+              <w:lastRenderedPageBreak/>
+              <w:drawing>
+                <wp:inline distT="0" distB="0" distL="0" distR="0">
+                  <wp:extent cx="6386830" cy="2999740"/>
+                  <wp:effectExtent l="19050" t="0" r="0" b="0"/>
+                  <wp:docPr id="25" name="Picture 25"/>
+                  <wp:cNvGraphicFramePr>
+                    <a:graphicFrameLocks xmlns:a="http://schemas.openxmlformats.org/drawingml/2006/main" noChangeAspect="1"/>
+                  </wp:cNvGraphicFramePr>
+                  <a:graphic xmlns:a="http://schemas.openxmlformats.org/drawingml/2006/main">
+                    <a:graphicData uri="http://schemas.openxmlformats.org/drawingml/2006/picture">
+                      <pic:pic xmlns:pic="http://schemas.openxmlformats.org/drawingml/2006/picture">
+                        <pic:nvPicPr>
+                          <pic:cNvPr id="0" name="Picture 25"/>
+                          <pic:cNvPicPr>
+                            <a:picLocks noChangeAspect="1" noChangeArrowheads="1"/>
+                          </pic:cNvPicPr>
+                        </pic:nvPicPr>
+                        <pic:blipFill>
+                          <a:blip r:embed="rId12"/>
+                          <a:srcRect/>
+                          <a:stretch>
+                            <a:fillRect/>
+                          </a:stretch>
+                        </pic:blipFill>
+                        <pic:spPr bwMode="auto">
+                          <a:xfrm>
+                            <a:off x="0" y="0"/>
+                            <a:ext cx="6386830" cy="2999740"/>
+                          </a:xfrm>
+                          <a:prstGeom prst="rect">
+                            <a:avLst/>
+                          </a:prstGeom>
+                          <a:noFill/>
+                          <a:ln w="9525">
+                            <a:noFill/>
+                            <a:miter lim="800000"/>
+                            <a:headEnd/>
+                            <a:tailEnd/>
+                          </a:ln>
+                        </pic:spPr>
+                      </pic:pic>
+                    </a:graphicData>
+                  </a:graphic>
+                </wp:inline>
+              </w:drawing>
+            </w:r>
+          </w:p>
+          <w:p>
+            <w:pPr>
+              <w:jc w:val="center"/>
+            </w:pPr>
+          </w:p>
+          <w:p>
+            <w:pPr>
+              <w:jc w:val="center"/>
+            </w:pPr>
+            <w:r>
+              <w:rPr>
+                <w:rFonts w:hint="eastAsia"/>
+                <w:noProof/>
+              </w:rPr>
+              <w:drawing>
+                <wp:inline distT="0" distB="0" distL="0" distR="0">
+                  <wp:extent cx="6386830" cy="3221355"/>
+                  <wp:effectExtent l="19050" t="0" r="0" b="0"/>
+                  <wp:docPr id="28" name="Picture 28"/>
+                  <wp:cNvGraphicFramePr>
+                    <a:graphicFrameLocks xmlns:a="http://schemas.openxmlformats.org/drawingml/2006/main" noChangeAspect="1"/>
+                  </wp:cNvGraphicFramePr>
+                  <a:graphic xmlns:a="http://schemas.openxmlformats.org/drawingml/2006/main">
+                    <a:graphicData uri="http://schemas.openxmlformats.org/drawingml/2006/picture">
+                      <pic:pic xmlns:pic="http://schemas.openxmlformats.org/drawingml/2006/picture">
+                        <pic:nvPicPr>
+                          <pic:cNvPr id="0" name="Picture 28"/>
+                          <pic:cNvPicPr>
+                            <a:picLocks noChangeAspect="1" noChangeArrowheads="1"/>
+                          </pic:cNvPicPr>
+                        </pic:nvPicPr>
+                        <pic:blipFill>
+                          <a:blip r:embed="rId13"/>
+                          <a:srcRect/>
+                          <a:stretch>
+                            <a:fillRect/>
+                          </a:stretch>
+                        </pic:blipFill>
+                        <pic:spPr bwMode="auto">
+                          <a:xfrm>
+                            <a:off x="0" y="0"/>
+                            <a:ext cx="6386830" cy="3221355"/>
+                          </a:xfrm>
+                          <a:prstGeom prst="rect">
+                            <a:avLst/>
+                          </a:prstGeom>
+                          <a:noFill/>
+                          <a:ln w="9525">
+                            <a:noFill/>
+                            <a:miter lim="800000"/>
+                            <a:headEnd/>
+                            <a:tailEnd/>
+                          </a:ln>
+                        </pic:spPr>
+                      </pic:pic>
+                    </a:graphicData>
+                  </a:graphic>
+                </wp:inline>
+              </w:drawing>
+            </w:r>
+          </w:p>
+          <w:p>
+            <w:pPr>
+              <w:jc w:val="center"/>
+            </w:pPr>
+          </w:p>
+          <w:p>
+            <w:pPr>
+              <w:jc w:val="center"/>
+            </w:pPr>
+            <w:r>
+              <w:rPr>
+                <w:rFonts w:hint="eastAsia"/>
+                <w:noProof/>
+              </w:rPr>
+              <w:drawing>
+                <wp:inline distT="0" distB="0" distL="0" distR="0">
+                  <wp:extent cx="6400800" cy="3221355"/>
+                  <wp:effectExtent l="19050" t="0" r="0" b="0"/>
+                  <wp:docPr id="31" name="Picture 31"/>
+                  <wp:cNvGraphicFramePr>
+                    <a:graphicFrameLocks xmlns:a="http://schemas.openxmlformats.org/drawingml/2006/main" noChangeAspect="1"/>
+                  </wp:cNvGraphicFramePr>
+                  <a:graphic xmlns:a="http://schemas.openxmlformats.org/drawingml/2006/main">
+                    <a:graphicData uri="http://schemas.openxmlformats.org/drawingml/2006/picture">
+                      <pic:pic xmlns:pic="http://schemas.openxmlformats.org/drawingml/2006/picture">
+                        <pic:nvPicPr>
+                          <pic:cNvPr id="0" name="Picture 31"/>
+                          <pic:cNvPicPr>
+                            <a:picLocks noChangeAspect="1" noChangeArrowheads="1"/>
+                          </pic:cNvPicPr>
+                        </pic:nvPicPr>
+                        <pic:blipFill>
+                          <a:blip r:embed="rId14"/>
+                          <a:srcRect/>
+                          <a:stretch>
+                            <a:fillRect/>
+                          </a:stretch>
+                        </pic:blipFill>
+                        <pic:spPr bwMode="auto">
+                          <a:xfrm>
+                            <a:off x="0" y="0"/>
+                            <a:ext cx="6400800" cy="3221355"/>
+                          </a:xfrm>
+                          <a:prstGeom prst="rect">
+                            <a:avLst/>
+                          </a:prstGeom>
+                          <a:noFill/>
+                          <a:ln w="9525">
+                            <a:noFill/>
+                            <a:miter lim="800000"/>
+                            <a:headEnd/>
+                            <a:tailEnd/>
+                          </a:ln>
+                        </pic:spPr>
+                      </pic:pic>
+                    </a:graphicData>
+                  </a:graphic>
+                </wp:inline>
+              </w:drawing>
             </w:r>
           </w:p>
         </w:tc>
@@ -910,11 +1581,7 @@
     </w:tbl>
     <w:p>
       <w:r>
-        <w:t>Use an authentic screenshot from the actual MLflow UI. The run names and metric values shown should correspond to the current training records.</w:t>
-      </w:r>
-    </w:p>
-    <w:p>
-      <w:r>
+        <w:lastRenderedPageBreak/>
         <w:br w:type="page"/>
       </w:r>
     </w:p>
@@ -923,6 +1590,7 @@
         <w:pStyle w:val="Heading1"/>
       </w:pPr>
       <w:r>
+        <w:lastRenderedPageBreak/>
         <w:t>5. API, Automated Testing, and Docker</w:t>
       </w:r>
     </w:p>
@@ -941,10 +1609,10 @@
     </w:p>
     <w:tbl>
       <w:tblPr>
-        <w:tblStyle w:val="LightShading-Accent1"/>
-        <w:tblW w:type="auto" w:w="0"/>
+        <w:tblStyle w:val="LightShading-Accent11"/>
+        <w:tblW w:w="0" w:type="auto"/>
         <w:jc w:val="center"/>
-        <w:tblLook w:firstColumn="1" w:firstRow="1" w:lastColumn="0" w:lastRow="0" w:noHBand="0" w:noVBand="1" w:val="04A0"/>
+        <w:tblLook w:val="04A0"/>
       </w:tblPr>
       <w:tblGrid>
         <w:gridCol w:w="5040"/>
@@ -952,16 +1620,18 @@
       </w:tblGrid>
       <w:tr>
         <w:trPr>
+          <w:cnfStyle w:val="100000000000"/>
           <w:cantSplit/>
+          <w:jc w:val="center"/>
         </w:trPr>
         <w:tc>
           <w:tcPr>
-            <w:tcW w:type="dxa" w:w="5040"/>
+            <w:cnfStyle w:val="001000000000"/>
+            <w:tcW w:w="5040" w:type="dxa"/>
           </w:tcPr>
           <w:p>
             <w:r>
               <w:rPr>
-                <w:b/>
                 <w:sz w:val="16"/>
               </w:rPr>
               <w:t>Endpoint</w:t>
@@ -970,12 +1640,14 @@
         </w:tc>
         <w:tc>
           <w:tcPr>
-            <w:tcW w:type="dxa" w:w="5040"/>
+            <w:tcW w:w="5040" w:type="dxa"/>
           </w:tcPr>
           <w:p>
+            <w:pPr>
+              <w:cnfStyle w:val="100000000000"/>
+            </w:pPr>
             <w:r>
               <w:rPr>
-                <w:b/>
                 <w:sz w:val="16"/>
               </w:rPr>
               <w:t>Purpose</w:t>
@@ -985,11 +1657,14 @@
       </w:tr>
       <w:tr>
         <w:trPr>
+          <w:cnfStyle w:val="000000100000"/>
           <w:cantSplit/>
+          <w:jc w:val="center"/>
         </w:trPr>
         <w:tc>
           <w:tcPr>
-            <w:tcW w:type="dxa" w:w="5040"/>
+            <w:cnfStyle w:val="001000000000"/>
+            <w:tcW w:w="5040" w:type="dxa"/>
           </w:tcPr>
           <w:p>
             <w:pPr>
@@ -1005,11 +1680,12 @@
         </w:tc>
         <w:tc>
           <w:tcPr>
-            <w:tcW w:type="dxa" w:w="5040"/>
+            <w:tcW w:w="5040" w:type="dxa"/>
           </w:tcPr>
           <w:p>
             <w:pPr>
               <w:spacing w:after="0"/>
+              <w:cnfStyle w:val="000000100000"/>
             </w:pPr>
             <w:r>
               <w:rPr>
@@ -1023,10 +1699,12 @@
       <w:tr>
         <w:trPr>
           <w:cantSplit/>
+          <w:jc w:val="center"/>
         </w:trPr>
         <w:tc>
           <w:tcPr>
-            <w:tcW w:type="dxa" w:w="5040"/>
+            <w:cnfStyle w:val="001000000000"/>
+            <w:tcW w:w="5040" w:type="dxa"/>
           </w:tcPr>
           <w:p>
             <w:pPr>
@@ -1042,11 +1720,12 @@
         </w:tc>
         <w:tc>
           <w:tcPr>
-            <w:tcW w:type="dxa" w:w="5040"/>
+            <w:tcW w:w="5040" w:type="dxa"/>
           </w:tcPr>
           <w:p>
             <w:pPr>
               <w:spacing w:after="0"/>
+              <w:cnfStyle w:val="000000000000"/>
             </w:pPr>
             <w:r>
               <w:rPr>
@@ -1059,11 +1738,14 @@
       </w:tr>
       <w:tr>
         <w:trPr>
+          <w:cnfStyle w:val="000000100000"/>
           <w:cantSplit/>
+          <w:jc w:val="center"/>
         </w:trPr>
         <w:tc>
           <w:tcPr>
-            <w:tcW w:type="dxa" w:w="5040"/>
+            <w:cnfStyle w:val="001000000000"/>
+            <w:tcW w:w="5040" w:type="dxa"/>
           </w:tcPr>
           <w:p>
             <w:pPr>
@@ -1079,11 +1761,12 @@
         </w:tc>
         <w:tc>
           <w:tcPr>
-            <w:tcW w:type="dxa" w:w="5040"/>
+            <w:tcW w:w="5040" w:type="dxa"/>
           </w:tcPr>
           <w:p>
             <w:pPr>
               <w:spacing w:after="0"/>
+              <w:cnfStyle w:val="000000100000"/>
             </w:pPr>
             <w:r>
               <w:rPr>
@@ -1097,10 +1780,12 @@
       <w:tr>
         <w:trPr>
           <w:cantSplit/>
+          <w:jc w:val="center"/>
         </w:trPr>
         <w:tc>
           <w:tcPr>
-            <w:tcW w:type="dxa" w:w="5040"/>
+            <w:cnfStyle w:val="001000000000"/>
+            <w:tcW w:w="5040" w:type="dxa"/>
           </w:tcPr>
           <w:p>
             <w:pPr>
@@ -1116,11 +1801,12 @@
         </w:tc>
         <w:tc>
           <w:tcPr>
-            <w:tcW w:type="dxa" w:w="5040"/>
+            <w:tcW w:w="5040" w:type="dxa"/>
           </w:tcPr>
           <w:p>
             <w:pPr>
               <w:spacing w:after="0"/>
+              <w:cnfStyle w:val="000000000000"/>
             </w:pPr>
             <w:r>
               <w:rPr>
@@ -1167,11 +1853,11 @@
     <w:tbl>
       <w:tblPr>
         <w:tblStyle w:val="TableGrid"/>
-        <w:tblW w:type="auto" w:w="0"/>
-        <w:tblLook w:firstColumn="1" w:firstRow="1" w:lastColumn="0" w:lastRow="0" w:noHBand="0" w:noVBand="1" w:val="04A0"/>
+        <w:tblW w:w="0" w:type="auto"/>
+        <w:tblLook w:val="04A0"/>
       </w:tblPr>
       <w:tblGrid>
-        <w:gridCol w:w="10080"/>
+        <w:gridCol w:w="10296"/>
       </w:tblGrid>
       <w:tr>
         <w:trPr>
@@ -1179,7 +1865,7 @@
         </w:trPr>
         <w:tc>
           <w:tcPr>
-            <w:tcW w:type="dxa" w:w="10080"/>
+            <w:tcW w:w="10080" w:type="dxa"/>
           </w:tcPr>
           <w:p>
             <w:pPr>
@@ -1187,13 +1873,115 @@
             </w:pPr>
             <w:r>
               <w:rPr>
-                <w:i/>
-                <w:color w:val="646464"/>
-                <w:sz w:val="16"/>
+                <w:rFonts w:hint="eastAsia"/>
+                <w:noProof/>
               </w:rPr>
-              <w:t>[SCREENSHOT PLACEHOLDER: Passing tests and local Docker/API health check]</w:t>
-              <w:br/>
-              <w:t>Replace this box with a genuine screenshot from the project environment.</w:t>
+              <w:drawing>
+                <wp:inline distT="0" distB="0" distL="0" distR="0">
+                  <wp:extent cx="6393815" cy="3629660"/>
+                  <wp:effectExtent l="19050" t="0" r="6985" b="0"/>
+                  <wp:docPr id="34" name="Picture 34"/>
+                  <wp:cNvGraphicFramePr>
+                    <a:graphicFrameLocks xmlns:a="http://schemas.openxmlformats.org/drawingml/2006/main" noChangeAspect="1"/>
+                  </wp:cNvGraphicFramePr>
+                  <a:graphic xmlns:a="http://schemas.openxmlformats.org/drawingml/2006/main">
+                    <a:graphicData uri="http://schemas.openxmlformats.org/drawingml/2006/picture">
+                      <pic:pic xmlns:pic="http://schemas.openxmlformats.org/drawingml/2006/picture">
+                        <pic:nvPicPr>
+                          <pic:cNvPr id="0" name="Picture 34"/>
+                          <pic:cNvPicPr>
+                            <a:picLocks noChangeAspect="1" noChangeArrowheads="1"/>
+                          </pic:cNvPicPr>
+                        </pic:nvPicPr>
+                        <pic:blipFill>
+                          <a:blip r:embed="rId15"/>
+                          <a:srcRect/>
+                          <a:stretch>
+                            <a:fillRect/>
+                          </a:stretch>
+                        </pic:blipFill>
+                        <pic:spPr bwMode="auto">
+                          <a:xfrm>
+                            <a:off x="0" y="0"/>
+                            <a:ext cx="6393815" cy="3629660"/>
+                          </a:xfrm>
+                          <a:prstGeom prst="rect">
+                            <a:avLst/>
+                          </a:prstGeom>
+                          <a:noFill/>
+                          <a:ln w="9525">
+                            <a:noFill/>
+                            <a:miter lim="800000"/>
+                            <a:headEnd/>
+                            <a:tailEnd/>
+                          </a:ln>
+                        </pic:spPr>
+                      </pic:pic>
+                    </a:graphicData>
+                  </a:graphic>
+                </wp:inline>
+              </w:drawing>
+            </w:r>
+          </w:p>
+          <w:p>
+            <w:pPr>
+              <w:jc w:val="center"/>
+            </w:pPr>
+          </w:p>
+          <w:p>
+            <w:pPr>
+              <w:jc w:val="center"/>
+            </w:pPr>
+            <w:r>
+              <w:rPr>
+                <w:rFonts w:hint="eastAsia"/>
+                <w:noProof/>
+              </w:rPr>
+              <w:drawing>
+                <wp:inline distT="0" distB="0" distL="0" distR="0">
+                  <wp:extent cx="6393815" cy="1156970"/>
+                  <wp:effectExtent l="19050" t="0" r="6985" b="0"/>
+                  <wp:docPr id="37" name="Picture 37"/>
+                  <wp:cNvGraphicFramePr>
+                    <a:graphicFrameLocks xmlns:a="http://schemas.openxmlformats.org/drawingml/2006/main" noChangeAspect="1"/>
+                  </wp:cNvGraphicFramePr>
+                  <a:graphic xmlns:a="http://schemas.openxmlformats.org/drawingml/2006/main">
+                    <a:graphicData uri="http://schemas.openxmlformats.org/drawingml/2006/picture">
+                      <pic:pic xmlns:pic="http://schemas.openxmlformats.org/drawingml/2006/picture">
+                        <pic:nvPicPr>
+                          <pic:cNvPr id="0" name="Picture 37"/>
+                          <pic:cNvPicPr>
+                            <a:picLocks noChangeAspect="1" noChangeArrowheads="1"/>
+                          </pic:cNvPicPr>
+                        </pic:nvPicPr>
+                        <pic:blipFill>
+                          <a:blip r:embed="rId16"/>
+                          <a:srcRect/>
+                          <a:stretch>
+                            <a:fillRect/>
+                          </a:stretch>
+                        </pic:blipFill>
+                        <pic:spPr bwMode="auto">
+                          <a:xfrm>
+                            <a:off x="0" y="0"/>
+                            <a:ext cx="6393815" cy="1156970"/>
+                          </a:xfrm>
+                          <a:prstGeom prst="rect">
+                            <a:avLst/>
+                          </a:prstGeom>
+                          <a:noFill/>
+                          <a:ln w="9525">
+                            <a:noFill/>
+                            <a:miter lim="800000"/>
+                            <a:headEnd/>
+                            <a:tailEnd/>
+                          </a:ln>
+                        </pic:spPr>
+                      </pic:pic>
+                    </a:graphicData>
+                  </a:graphic>
+                </wp:inline>
+              </w:drawing>
             </w:r>
           </w:p>
         </w:tc>
@@ -1201,6 +1989,7 @@
     </w:tbl>
     <w:p>
       <w:r>
+        <w:lastRenderedPageBreak/>
         <w:br w:type="page"/>
       </w:r>
     </w:p>
@@ -1209,6 +1998,7 @@
         <w:pStyle w:val="Heading1"/>
       </w:pPr>
       <w:r>
+        <w:lastRenderedPageBreak/>
         <w:t>6. CI/CD and Container Registry</w:t>
       </w:r>
     </w:p>
@@ -1290,11 +2080,11 @@
     <w:tbl>
       <w:tblPr>
         <w:tblStyle w:val="TableGrid"/>
-        <w:tblW w:type="auto" w:w="0"/>
-        <w:tblLook w:firstColumn="1" w:firstRow="1" w:lastColumn="0" w:lastRow="0" w:noHBand="0" w:noVBand="1" w:val="04A0"/>
+        <w:tblW w:w="0" w:type="auto"/>
+        <w:tblLook w:val="04A0"/>
       </w:tblPr>
       <w:tblGrid>
-        <w:gridCol w:w="10080"/>
+        <w:gridCol w:w="10296"/>
       </w:tblGrid>
       <w:tr>
         <w:trPr>
@@ -1302,7 +2092,7 @@
         </w:trPr>
         <w:tc>
           <w:tcPr>
-            <w:tcW w:type="dxa" w:w="10080"/>
+            <w:tcW w:w="10080" w:type="dxa"/>
           </w:tcPr>
           <w:p>
             <w:pPr>
@@ -1311,47 +2101,195 @@
             <w:r>
               <w:rPr>
                 <w:i/>
+                <w:noProof/>
                 <w:color w:val="646464"/>
                 <w:sz w:val="16"/>
               </w:rPr>
-              <w:t>[SCREENSHOT PLACEHOLDER: Successful GitHub Actions CI and publish jobs]</w:t>
-              <w:br/>
-              <w:t>Replace this box with a genuine screenshot from the project environment.</w:t>
+              <w:drawing>
+                <wp:inline distT="0" distB="0" distL="0" distR="0">
+                  <wp:extent cx="6386830" cy="3193415"/>
+                  <wp:effectExtent l="19050" t="0" r="0" b="0"/>
+                  <wp:docPr id="40" name="Picture 40"/>
+                  <wp:cNvGraphicFramePr>
+                    <a:graphicFrameLocks xmlns:a="http://schemas.openxmlformats.org/drawingml/2006/main" noChangeAspect="1"/>
+                  </wp:cNvGraphicFramePr>
+                  <a:graphic xmlns:a="http://schemas.openxmlformats.org/drawingml/2006/main">
+                    <a:graphicData uri="http://schemas.openxmlformats.org/drawingml/2006/picture">
+                      <pic:pic xmlns:pic="http://schemas.openxmlformats.org/drawingml/2006/picture">
+                        <pic:nvPicPr>
+                          <pic:cNvPr id="0" name="Picture 40"/>
+                          <pic:cNvPicPr>
+                            <a:picLocks noChangeAspect="1" noChangeArrowheads="1"/>
+                          </pic:cNvPicPr>
+                        </pic:nvPicPr>
+                        <pic:blipFill>
+                          <a:blip r:embed="rId17"/>
+                          <a:srcRect/>
+                          <a:stretch>
+                            <a:fillRect/>
+                          </a:stretch>
+                        </pic:blipFill>
+                        <pic:spPr bwMode="auto">
+                          <a:xfrm>
+                            <a:off x="0" y="0"/>
+                            <a:ext cx="6386830" cy="3193415"/>
+                          </a:xfrm>
+                          <a:prstGeom prst="rect">
+                            <a:avLst/>
+                          </a:prstGeom>
+                          <a:noFill/>
+                          <a:ln w="9525">
+                            <a:noFill/>
+                            <a:miter lim="800000"/>
+                            <a:headEnd/>
+                            <a:tailEnd/>
+                          </a:ln>
+                        </pic:spPr>
+                      </pic:pic>
+                    </a:graphicData>
+                  </a:graphic>
+                </wp:inline>
+              </w:drawing>
+            </w:r>
+            <w:r>
+              <w:rPr>
+                <w:i/>
+                <w:color w:val="646464"/>
+                <w:sz w:val="16"/>
+              </w:rPr>
+              <w:t>t.</w:t>
             </w:r>
           </w:p>
         </w:tc>
       </w:tr>
-    </w:tbl>
-    <w:tbl>
-      <w:tblPr>
-        <w:tblStyle w:val="TableGrid"/>
-        <w:tblW w:type="auto" w:w="0"/>
-        <w:tblLook w:firstColumn="1" w:firstRow="1" w:lastColumn="0" w:lastRow="0" w:noHBand="0" w:noVBand="1" w:val="04A0"/>
-      </w:tblPr>
-      <w:tblGrid>
-        <w:gridCol w:w="10080"/>
-      </w:tblGrid>
       <w:tr>
         <w:trPr>
           <w:cantSplit/>
         </w:trPr>
         <w:tc>
           <w:tcPr>
-            <w:tcW w:type="dxa" w:w="10080"/>
+            <w:tcW w:w="10080" w:type="dxa"/>
           </w:tcPr>
+          <w:p>
+            <w:pPr>
+              <w:jc w:val="center"/>
+            </w:pPr>
+          </w:p>
           <w:p>
             <w:pPr>
               <w:jc w:val="center"/>
             </w:pPr>
             <w:r>
               <w:rPr>
-                <w:i/>
-                <w:color w:val="646464"/>
-                <w:sz w:val="16"/>
+                <w:rFonts w:hint="eastAsia"/>
+                <w:noProof/>
               </w:rPr>
-              <w:t>[SCREENSHOT PLACEHOLDER: Docker Hub repository and published image tags]</w:t>
-              <w:br/>
-              <w:t>Replace this box with a genuine screenshot from the project environment.</w:t>
+              <w:drawing>
+                <wp:inline distT="0" distB="0" distL="0" distR="0">
+                  <wp:extent cx="6400800" cy="3117215"/>
+                  <wp:effectExtent l="19050" t="0" r="0" b="0"/>
+                  <wp:docPr id="43" name="Picture 43"/>
+                  <wp:cNvGraphicFramePr>
+                    <a:graphicFrameLocks xmlns:a="http://schemas.openxmlformats.org/drawingml/2006/main" noChangeAspect="1"/>
+                  </wp:cNvGraphicFramePr>
+                  <a:graphic xmlns:a="http://schemas.openxmlformats.org/drawingml/2006/main">
+                    <a:graphicData uri="http://schemas.openxmlformats.org/drawingml/2006/picture">
+                      <pic:pic xmlns:pic="http://schemas.openxmlformats.org/drawingml/2006/picture">
+                        <pic:nvPicPr>
+                          <pic:cNvPr id="0" name="Picture 43"/>
+                          <pic:cNvPicPr>
+                            <a:picLocks noChangeAspect="1" noChangeArrowheads="1"/>
+                          </pic:cNvPicPr>
+                        </pic:nvPicPr>
+                        <pic:blipFill>
+                          <a:blip r:embed="rId18"/>
+                          <a:srcRect/>
+                          <a:stretch>
+                            <a:fillRect/>
+                          </a:stretch>
+                        </pic:blipFill>
+                        <pic:spPr bwMode="auto">
+                          <a:xfrm>
+                            <a:off x="0" y="0"/>
+                            <a:ext cx="6400800" cy="3117215"/>
+                          </a:xfrm>
+                          <a:prstGeom prst="rect">
+                            <a:avLst/>
+                          </a:prstGeom>
+                          <a:noFill/>
+                          <a:ln w="9525">
+                            <a:noFill/>
+                            <a:miter lim="800000"/>
+                            <a:headEnd/>
+                            <a:tailEnd/>
+                          </a:ln>
+                        </pic:spPr>
+                      </pic:pic>
+                    </a:graphicData>
+                  </a:graphic>
+                </wp:inline>
+              </w:drawing>
+            </w:r>
+          </w:p>
+          <w:p>
+            <w:pPr>
+              <w:jc w:val="center"/>
+            </w:pPr>
+          </w:p>
+          <w:p>
+            <w:pPr>
+              <w:jc w:val="center"/>
+            </w:pPr>
+            <w:r>
+              <w:rPr>
+                <w:rFonts w:hint="eastAsia"/>
+                <w:noProof/>
+              </w:rPr>
+              <w:drawing>
+                <wp:inline distT="0" distB="0" distL="0" distR="0">
+                  <wp:extent cx="6393815" cy="3186430"/>
+                  <wp:effectExtent l="19050" t="0" r="6985" b="0"/>
+                  <wp:docPr id="46" name="Picture 46"/>
+                  <wp:cNvGraphicFramePr>
+                    <a:graphicFrameLocks xmlns:a="http://schemas.openxmlformats.org/drawingml/2006/main" noChangeAspect="1"/>
+                  </wp:cNvGraphicFramePr>
+                  <a:graphic xmlns:a="http://schemas.openxmlformats.org/drawingml/2006/main">
+                    <a:graphicData uri="http://schemas.openxmlformats.org/drawingml/2006/picture">
+                      <pic:pic xmlns:pic="http://schemas.openxmlformats.org/drawingml/2006/picture">
+                        <pic:nvPicPr>
+                          <pic:cNvPr id="0" name="Picture 46"/>
+                          <pic:cNvPicPr>
+                            <a:picLocks noChangeAspect="1" noChangeArrowheads="1"/>
+                          </pic:cNvPicPr>
+                        </pic:nvPicPr>
+                        <pic:blipFill>
+                          <a:blip r:embed="rId19"/>
+                          <a:srcRect/>
+                          <a:stretch>
+                            <a:fillRect/>
+                          </a:stretch>
+                        </pic:blipFill>
+                        <pic:spPr bwMode="auto">
+                          <a:xfrm>
+                            <a:off x="0" y="0"/>
+                            <a:ext cx="6393815" cy="3186430"/>
+                          </a:xfrm>
+                          <a:prstGeom prst="rect">
+                            <a:avLst/>
+                          </a:prstGeom>
+                          <a:noFill/>
+                          <a:ln w="9525">
+                            <a:noFill/>
+                            <a:miter lim="800000"/>
+                            <a:headEnd/>
+                            <a:tailEnd/>
+                          </a:ln>
+                        </pic:spPr>
+                      </pic:pic>
+                    </a:graphicData>
+                  </a:graphic>
+                </wp:inline>
+              </w:drawing>
             </w:r>
           </w:p>
         </w:tc>
@@ -1372,6 +2310,7 @@
         <w:pStyle w:val="Heading1"/>
       </w:pPr>
       <w:r>
+        <w:lastRenderedPageBreak/>
         <w:t>7. Kubernetes Deployment and API Verification</w:t>
       </w:r>
     </w:p>
@@ -1474,11 +2413,11 @@
     <w:tbl>
       <w:tblPr>
         <w:tblStyle w:val="TableGrid"/>
-        <w:tblW w:type="auto" w:w="0"/>
-        <w:tblLook w:firstColumn="1" w:firstRow="1" w:lastColumn="0" w:lastRow="0" w:noHBand="0" w:noVBand="1" w:val="04A0"/>
+        <w:tblW w:w="0" w:type="auto"/>
+        <w:tblLook w:val="04A0"/>
       </w:tblPr>
       <w:tblGrid>
-        <w:gridCol w:w="10080"/>
+        <w:gridCol w:w="10296"/>
       </w:tblGrid>
       <w:tr>
         <w:trPr>
@@ -1486,7 +2425,7 @@
         </w:trPr>
         <w:tc>
           <w:tcPr>
-            <w:tcW w:type="dxa" w:w="10080"/>
+            <w:tcW w:w="10080" w:type="dxa"/>
           </w:tcPr>
           <w:p>
             <w:pPr>
@@ -1494,34 +2433,65 @@
             </w:pPr>
             <w:r>
               <w:rPr>
-                <w:i/>
-                <w:color w:val="646464"/>
-                <w:sz w:val="16"/>
+                <w:rFonts w:hint="eastAsia"/>
+                <w:noProof/>
               </w:rPr>
-              <w:t>[SCREENSHOT PLACEHOLDER: Kubernetes resources and rollout status]</w:t>
-              <w:br/>
-              <w:t>Replace this box with a genuine screenshot from the project environment.</w:t>
+              <w:drawing>
+                <wp:inline distT="0" distB="0" distL="0" distR="0">
+                  <wp:extent cx="6400800" cy="3602355"/>
+                  <wp:effectExtent l="19050" t="0" r="0" b="0"/>
+                  <wp:docPr id="49" name="Picture 49"/>
+                  <wp:cNvGraphicFramePr>
+                    <a:graphicFrameLocks xmlns:a="http://schemas.openxmlformats.org/drawingml/2006/main" noChangeAspect="1"/>
+                  </wp:cNvGraphicFramePr>
+                  <a:graphic xmlns:a="http://schemas.openxmlformats.org/drawingml/2006/main">
+                    <a:graphicData uri="http://schemas.openxmlformats.org/drawingml/2006/picture">
+                      <pic:pic xmlns:pic="http://schemas.openxmlformats.org/drawingml/2006/picture">
+                        <pic:nvPicPr>
+                          <pic:cNvPr id="0" name="Picture 49"/>
+                          <pic:cNvPicPr>
+                            <a:picLocks noChangeAspect="1" noChangeArrowheads="1"/>
+                          </pic:cNvPicPr>
+                        </pic:nvPicPr>
+                        <pic:blipFill>
+                          <a:blip r:embed="rId20"/>
+                          <a:srcRect/>
+                          <a:stretch>
+                            <a:fillRect/>
+                          </a:stretch>
+                        </pic:blipFill>
+                        <pic:spPr bwMode="auto">
+                          <a:xfrm>
+                            <a:off x="0" y="0"/>
+                            <a:ext cx="6400800" cy="3602355"/>
+                          </a:xfrm>
+                          <a:prstGeom prst="rect">
+                            <a:avLst/>
+                          </a:prstGeom>
+                          <a:noFill/>
+                          <a:ln w="9525">
+                            <a:noFill/>
+                            <a:miter lim="800000"/>
+                            <a:headEnd/>
+                            <a:tailEnd/>
+                          </a:ln>
+                        </pic:spPr>
+                      </pic:pic>
+                    </a:graphicData>
+                  </a:graphic>
+                </wp:inline>
+              </w:drawing>
             </w:r>
           </w:p>
         </w:tc>
       </w:tr>
-    </w:tbl>
-    <w:tbl>
-      <w:tblPr>
-        <w:tblStyle w:val="TableGrid"/>
-        <w:tblW w:type="auto" w:w="0"/>
-        <w:tblLook w:firstColumn="1" w:firstRow="1" w:lastColumn="0" w:lastRow="0" w:noHBand="0" w:noVBand="1" w:val="04A0"/>
-      </w:tblPr>
-      <w:tblGrid>
-        <w:gridCol w:w="10080"/>
-      </w:tblGrid>
       <w:tr>
         <w:trPr>
           <w:cantSplit/>
         </w:trPr>
         <w:tc>
           <w:tcPr>
-            <w:tcW w:type="dxa" w:w="10080"/>
+            <w:tcW w:w="10080" w:type="dxa"/>
           </w:tcPr>
           <w:p>
             <w:pPr>
@@ -1529,13 +2499,54 @@
             </w:pPr>
             <w:r>
               <w:rPr>
-                <w:i/>
-                <w:color w:val="646464"/>
-                <w:sz w:val="16"/>
+                <w:rFonts w:hint="eastAsia"/>
+                <w:noProof/>
               </w:rPr>
-              <w:t>[SCREENSHOT PLACEHOLDER: Successful health and prediction requests]</w:t>
-              <w:br/>
-              <w:t>Replace this box with a genuine screenshot from the project environment.</w:t>
+              <w:drawing>
+                <wp:inline distT="0" distB="0" distL="0" distR="0">
+                  <wp:extent cx="6393815" cy="1226185"/>
+                  <wp:effectExtent l="19050" t="0" r="6985" b="0"/>
+                  <wp:docPr id="52" name="Picture 52"/>
+                  <wp:cNvGraphicFramePr>
+                    <a:graphicFrameLocks xmlns:a="http://schemas.openxmlformats.org/drawingml/2006/main" noChangeAspect="1"/>
+                  </wp:cNvGraphicFramePr>
+                  <a:graphic xmlns:a="http://schemas.openxmlformats.org/drawingml/2006/main">
+                    <a:graphicData uri="http://schemas.openxmlformats.org/drawingml/2006/picture">
+                      <pic:pic xmlns:pic="http://schemas.openxmlformats.org/drawingml/2006/picture">
+                        <pic:nvPicPr>
+                          <pic:cNvPr id="0" name="Picture 52"/>
+                          <pic:cNvPicPr>
+                            <a:picLocks noChangeAspect="1" noChangeArrowheads="1"/>
+                          </pic:cNvPicPr>
+                        </pic:nvPicPr>
+                        <pic:blipFill>
+                          <a:blip r:embed="rId21"/>
+                          <a:srcRect/>
+                          <a:stretch>
+                            <a:fillRect/>
+                          </a:stretch>
+                        </pic:blipFill>
+                        <pic:spPr bwMode="auto">
+                          <a:xfrm>
+                            <a:off x="0" y="0"/>
+                            <a:ext cx="6393815" cy="1226185"/>
+                          </a:xfrm>
+                          <a:prstGeom prst="rect">
+                            <a:avLst/>
+                          </a:prstGeom>
+                          <a:noFill/>
+                          <a:ln w="9525">
+                            <a:noFill/>
+                            <a:miter lim="800000"/>
+                            <a:headEnd/>
+                            <a:tailEnd/>
+                          </a:ln>
+                        </pic:spPr>
+                      </pic:pic>
+                    </a:graphicData>
+                  </a:graphic>
+                </wp:inline>
+              </w:drawing>
             </w:r>
           </w:p>
         </w:tc>
@@ -1556,6 +2567,7 @@
         <w:pStyle w:val="Heading1"/>
       </w:pPr>
       <w:r>
+        <w:lastRenderedPageBreak/>
         <w:t>8. Monitoring, Logging, and Limitations</w:t>
       </w:r>
     </w:p>
@@ -1574,10 +2586,10 @@
     </w:p>
     <w:tbl>
       <w:tblPr>
-        <w:tblStyle w:val="LightShading-Accent1"/>
-        <w:tblW w:type="auto" w:w="0"/>
+        <w:tblStyle w:val="LightShading-Accent11"/>
+        <w:tblW w:w="0" w:type="auto"/>
         <w:jc w:val="center"/>
-        <w:tblLook w:firstColumn="1" w:firstRow="1" w:lastColumn="0" w:lastRow="0" w:noHBand="0" w:noVBand="1" w:val="04A0"/>
+        <w:tblLook w:val="04A0"/>
       </w:tblPr>
       <w:tblGrid>
         <w:gridCol w:w="5040"/>
@@ -1585,16 +2597,18 @@
       </w:tblGrid>
       <w:tr>
         <w:trPr>
+          <w:cnfStyle w:val="100000000000"/>
           <w:cantSplit/>
+          <w:jc w:val="center"/>
         </w:trPr>
         <w:tc>
           <w:tcPr>
-            <w:tcW w:type="dxa" w:w="5040"/>
+            <w:cnfStyle w:val="001000000000"/>
+            <w:tcW w:w="5040" w:type="dxa"/>
           </w:tcPr>
           <w:p>
             <w:r>
               <w:rPr>
-                <w:b/>
                 <w:sz w:val="16"/>
               </w:rPr>
               <w:t>Metric</w:t>
@@ -1603,12 +2617,14 @@
         </w:tc>
         <w:tc>
           <w:tcPr>
-            <w:tcW w:type="dxa" w:w="5040"/>
+            <w:tcW w:w="5040" w:type="dxa"/>
           </w:tcPr>
           <w:p>
+            <w:pPr>
+              <w:cnfStyle w:val="100000000000"/>
+            </w:pPr>
             <w:r>
               <w:rPr>
-                <w:b/>
                 <w:sz w:val="16"/>
               </w:rPr>
               <w:t>Meaning</w:t>
@@ -1618,11 +2634,14 @@
       </w:tr>
       <w:tr>
         <w:trPr>
+          <w:cnfStyle w:val="000000100000"/>
           <w:cantSplit/>
+          <w:jc w:val="center"/>
         </w:trPr>
         <w:tc>
           <w:tcPr>
-            <w:tcW w:type="dxa" w:w="5040"/>
+            <w:cnfStyle w:val="001000000000"/>
+            <w:tcW w:w="5040" w:type="dxa"/>
           </w:tcPr>
           <w:p>
             <w:pPr>
@@ -1638,11 +2657,12 @@
         </w:tc>
         <w:tc>
           <w:tcPr>
-            <w:tcW w:type="dxa" w:w="5040"/>
+            <w:tcW w:w="5040" w:type="dxa"/>
           </w:tcPr>
           <w:p>
             <w:pPr>
               <w:spacing w:after="0"/>
+              <w:cnfStyle w:val="000000100000"/>
             </w:pPr>
             <w:r>
               <w:rPr>
@@ -1656,10 +2676,12 @@
       <w:tr>
         <w:trPr>
           <w:cantSplit/>
+          <w:jc w:val="center"/>
         </w:trPr>
         <w:tc>
           <w:tcPr>
-            <w:tcW w:type="dxa" w:w="5040"/>
+            <w:cnfStyle w:val="001000000000"/>
+            <w:tcW w:w="5040" w:type="dxa"/>
           </w:tcPr>
           <w:p>
             <w:pPr>
@@ -1675,11 +2697,12 @@
         </w:tc>
         <w:tc>
           <w:tcPr>
-            <w:tcW w:type="dxa" w:w="5040"/>
+            <w:tcW w:w="5040" w:type="dxa"/>
           </w:tcPr>
           <w:p>
             <w:pPr>
               <w:spacing w:after="0"/>
+              <w:cnfStyle w:val="000000000000"/>
             </w:pPr>
             <w:r>
               <w:rPr>
@@ -1692,11 +2715,14 @@
       </w:tr>
       <w:tr>
         <w:trPr>
+          <w:cnfStyle w:val="000000100000"/>
           <w:cantSplit/>
+          <w:jc w:val="center"/>
         </w:trPr>
         <w:tc>
           <w:tcPr>
-            <w:tcW w:type="dxa" w:w="5040"/>
+            <w:cnfStyle w:val="001000000000"/>
+            <w:tcW w:w="5040" w:type="dxa"/>
           </w:tcPr>
           <w:p>
             <w:pPr>
@@ -1712,11 +2738,12 @@
         </w:tc>
         <w:tc>
           <w:tcPr>
-            <w:tcW w:type="dxa" w:w="5040"/>
+            <w:tcW w:w="5040" w:type="dxa"/>
           </w:tcPr>
           <w:p>
             <w:pPr>
               <w:spacing w:after="0"/>
+              <w:cnfStyle w:val="000000100000"/>
             </w:pPr>
             <w:r>
               <w:rPr>
@@ -1730,10 +2757,12 @@
       <w:tr>
         <w:trPr>
           <w:cantSplit/>
+          <w:jc w:val="center"/>
         </w:trPr>
         <w:tc>
           <w:tcPr>
-            <w:tcW w:type="dxa" w:w="5040"/>
+            <w:cnfStyle w:val="001000000000"/>
+            <w:tcW w:w="5040" w:type="dxa"/>
           </w:tcPr>
           <w:p>
             <w:pPr>
@@ -1749,11 +2778,12 @@
         </w:tc>
         <w:tc>
           <w:tcPr>
-            <w:tcW w:type="dxa" w:w="5040"/>
+            <w:tcW w:w="5040" w:type="dxa"/>
           </w:tcPr>
           <w:p>
             <w:pPr>
               <w:spacing w:after="0"/>
+              <w:cnfStyle w:val="000000000000"/>
             </w:pPr>
             <w:r>
               <w:rPr>
@@ -1840,11 +2870,11 @@
     <w:tbl>
       <w:tblPr>
         <w:tblStyle w:val="TableGrid"/>
-        <w:tblW w:type="auto" w:w="0"/>
-        <w:tblLook w:firstColumn="1" w:firstRow="1" w:lastColumn="0" w:lastRow="0" w:noHBand="0" w:noVBand="1" w:val="04A0"/>
+        <w:tblW w:w="0" w:type="auto"/>
+        <w:tblLook w:val="04A0"/>
       </w:tblPr>
       <w:tblGrid>
-        <w:gridCol w:w="10080"/>
+        <w:gridCol w:w="10296"/>
       </w:tblGrid>
       <w:tr>
         <w:trPr>
@@ -1852,7 +2882,7 @@
         </w:trPr>
         <w:tc>
           <w:tcPr>
-            <w:tcW w:type="dxa" w:w="10080"/>
+            <w:tcW w:w="10080" w:type="dxa"/>
           </w:tcPr>
           <w:p>
             <w:pPr>
@@ -1860,13 +2890,116 @@
             </w:pPr>
             <w:r>
               <w:rPr>
-                <w:i/>
-                <w:color w:val="646464"/>
-                <w:sz w:val="16"/>
+                <w:rFonts w:hint="eastAsia"/>
+                <w:noProof/>
               </w:rPr>
-              <w:t>[SCREENSHOT PLACEHOLDER: Prometheus-compatible metrics endpoint]</w:t>
-              <w:br/>
-              <w:t>Replace this box with a genuine screenshot from the project environment.</w:t>
+              <w:lastRenderedPageBreak/>
+              <w:drawing>
+                <wp:inline distT="0" distB="0" distL="0" distR="0">
+                  <wp:extent cx="6393815" cy="2542540"/>
+                  <wp:effectExtent l="19050" t="0" r="6985" b="0"/>
+                  <wp:docPr id="55" name="Picture 55"/>
+                  <wp:cNvGraphicFramePr>
+                    <a:graphicFrameLocks xmlns:a="http://schemas.openxmlformats.org/drawingml/2006/main" noChangeAspect="1"/>
+                  </wp:cNvGraphicFramePr>
+                  <a:graphic xmlns:a="http://schemas.openxmlformats.org/drawingml/2006/main">
+                    <a:graphicData uri="http://schemas.openxmlformats.org/drawingml/2006/picture">
+                      <pic:pic xmlns:pic="http://schemas.openxmlformats.org/drawingml/2006/picture">
+                        <pic:nvPicPr>
+                          <pic:cNvPr id="0" name="Picture 55"/>
+                          <pic:cNvPicPr>
+                            <a:picLocks noChangeAspect="1" noChangeArrowheads="1"/>
+                          </pic:cNvPicPr>
+                        </pic:nvPicPr>
+                        <pic:blipFill>
+                          <a:blip r:embed="rId22"/>
+                          <a:srcRect/>
+                          <a:stretch>
+                            <a:fillRect/>
+                          </a:stretch>
+                        </pic:blipFill>
+                        <pic:spPr bwMode="auto">
+                          <a:xfrm>
+                            <a:off x="0" y="0"/>
+                            <a:ext cx="6393815" cy="2542540"/>
+                          </a:xfrm>
+                          <a:prstGeom prst="rect">
+                            <a:avLst/>
+                          </a:prstGeom>
+                          <a:noFill/>
+                          <a:ln w="9525">
+                            <a:noFill/>
+                            <a:miter lim="800000"/>
+                            <a:headEnd/>
+                            <a:tailEnd/>
+                          </a:ln>
+                        </pic:spPr>
+                      </pic:pic>
+                    </a:graphicData>
+                  </a:graphic>
+                </wp:inline>
+              </w:drawing>
+            </w:r>
+          </w:p>
+          <w:p>
+            <w:pPr>
+              <w:jc w:val="center"/>
+            </w:pPr>
+          </w:p>
+          <w:p>
+            <w:pPr>
+              <w:jc w:val="center"/>
+            </w:pPr>
+            <w:r>
+              <w:rPr>
+                <w:rFonts w:hint="eastAsia"/>
+                <w:noProof/>
+              </w:rPr>
+              <w:drawing>
+                <wp:inline distT="0" distB="0" distL="0" distR="0">
+                  <wp:extent cx="6393815" cy="2888615"/>
+                  <wp:effectExtent l="19050" t="0" r="6985" b="0"/>
+                  <wp:docPr id="58" name="Picture 58"/>
+                  <wp:cNvGraphicFramePr>
+                    <a:graphicFrameLocks xmlns:a="http://schemas.openxmlformats.org/drawingml/2006/main" noChangeAspect="1"/>
+                  </wp:cNvGraphicFramePr>
+                  <a:graphic xmlns:a="http://schemas.openxmlformats.org/drawingml/2006/main">
+                    <a:graphicData uri="http://schemas.openxmlformats.org/drawingml/2006/picture">
+                      <pic:pic xmlns:pic="http://schemas.openxmlformats.org/drawingml/2006/picture">
+                        <pic:nvPicPr>
+                          <pic:cNvPr id="0" name="Picture 58"/>
+                          <pic:cNvPicPr>
+                            <a:picLocks noChangeAspect="1" noChangeArrowheads="1"/>
+                          </pic:cNvPicPr>
+                        </pic:nvPicPr>
+                        <pic:blipFill>
+                          <a:blip r:embed="rId23"/>
+                          <a:srcRect/>
+                          <a:stretch>
+                            <a:fillRect/>
+                          </a:stretch>
+                        </pic:blipFill>
+                        <pic:spPr bwMode="auto">
+                          <a:xfrm>
+                            <a:off x="0" y="0"/>
+                            <a:ext cx="6393815" cy="2888615"/>
+                          </a:xfrm>
+                          <a:prstGeom prst="rect">
+                            <a:avLst/>
+                          </a:prstGeom>
+                          <a:noFill/>
+                          <a:ln w="9525">
+                            <a:noFill/>
+                            <a:miter lim="800000"/>
+                            <a:headEnd/>
+                            <a:tailEnd/>
+                          </a:ln>
+                        </pic:spPr>
+                      </pic:pic>
+                    </a:graphicData>
+                  </a:graphic>
+                </wp:inline>
+              </w:drawing>
             </w:r>
           </w:p>
         </w:tc>
@@ -1882,6 +3015,7 @@
         <w:pStyle w:val="Heading1"/>
       </w:pPr>
       <w:r>
+        <w:lastRenderedPageBreak/>
         <w:t>9. Conclusion and Submission Checklist</w:t>
       </w:r>
     </w:p>
@@ -2107,8 +3241,8 @@
       </w:r>
     </w:p>
     <w:sectPr>
-      <w:headerReference w:type="default" r:id="rId9"/>
-      <w:footerReference w:type="default" r:id="rId10"/>
+      <w:headerReference w:type="default" r:id="rId24"/>
+      <w:footerReference w:type="default" r:id="rId25"/>
       <w:pgSz w:w="12240" w:h="15840"/>
       <w:pgMar w:top="936" w:right="1080" w:bottom="864" w:left="1080" w:header="720" w:footer="720" w:gutter="0"/>
       <w:cols w:space="720"/>
@@ -2118,8 +3252,33 @@
 </w:document>
 </file>
 
+<file path=word/endnotes.xml><?xml version="1.0" encoding="utf-8"?>
+<w:endnotes xmlns:ve="http://schemas.openxmlformats.org/markup-compatibility/2006" xmlns:o="urn:schemas-microsoft-com:office:office" xmlns:r="http://schemas.openxmlformats.org/officeDocument/2006/relationships" xmlns:m="http://schemas.openxmlformats.org/officeDocument/2006/math" xmlns:v="urn:schemas-microsoft-com:vml" xmlns:wp="http://schemas.openxmlformats.org/drawingml/2006/wordprocessingDrawing" xmlns:w10="urn:schemas-microsoft-com:office:word" xmlns:w="http://schemas.openxmlformats.org/wordprocessingml/2006/main" xmlns:wne="http://schemas.microsoft.com/office/word/2006/wordml">
+  <w:endnote w:type="separator" w:id="0">
+    <w:p>
+      <w:pPr>
+        <w:spacing w:after="0" w:line="240" w:lineRule="auto"/>
+      </w:pPr>
+      <w:r>
+        <w:separator/>
+      </w:r>
+    </w:p>
+  </w:endnote>
+  <w:endnote w:type="continuationSeparator" w:id="1">
+    <w:p>
+      <w:pPr>
+        <w:spacing w:after="0" w:line="240" w:lineRule="auto"/>
+      </w:pPr>
+      <w:r>
+        <w:continuationSeparator/>
+      </w:r>
+    </w:p>
+  </w:endnote>
+</w:endnotes>
+</file>
+
 <file path=word/footer1.xml><?xml version="1.0" encoding="utf-8"?>
-<w:ftr xmlns:m="http://schemas.openxmlformats.org/officeDocument/2006/math" xmlns:mc="http://schemas.openxmlformats.org/markup-compatibility/2006" xmlns:mo="http://schemas.microsoft.com/office/mac/office/2008/main" xmlns:mv="urn:schemas-microsoft-com:mac:vml" xmlns:o="urn:schemas-microsoft-com:office:office" xmlns:r="http://schemas.openxmlformats.org/officeDocument/2006/relationships" xmlns:v="urn:schemas-microsoft-com:vml" xmlns:w10="urn:schemas-microsoft-com:office:word" xmlns:w14="http://schemas.microsoft.com/office/word/2010/wordml" xmlns:w="http://schemas.openxmlformats.org/wordprocessingml/2006/main" xmlns:wne="http://schemas.microsoft.com/office/word/2006/wordml" xmlns:wp14="http://schemas.microsoft.com/office/word/2010/wordprocessingDrawing" xmlns:wp="http://schemas.openxmlformats.org/drawingml/2006/wordprocessingDrawing" xmlns:wpc="http://schemas.microsoft.com/office/word/2010/wordprocessingCanvas" xmlns:wpg="http://schemas.microsoft.com/office/word/2010/wordprocessingGroup" xmlns:wpi="http://schemas.microsoft.com/office/word/2010/wordprocessingInk" xmlns:wps="http://schemas.microsoft.com/office/word/2010/wordprocessingShape" mc:Ignorable="w14 wp14">
+<w:ftr xmlns:ve="http://schemas.openxmlformats.org/markup-compatibility/2006" xmlns:o="urn:schemas-microsoft-com:office:office" xmlns:r="http://schemas.openxmlformats.org/officeDocument/2006/relationships" xmlns:m="http://schemas.openxmlformats.org/officeDocument/2006/math" xmlns:v="urn:schemas-microsoft-com:vml" xmlns:wp="http://schemas.openxmlformats.org/drawingml/2006/wordprocessingDrawing" xmlns:w10="urn:schemas-microsoft-com:office:word" xmlns:w="http://schemas.openxmlformats.org/wordprocessingml/2006/main" xmlns:wne="http://schemas.microsoft.com/office/word/2006/wordml">
   <w:p>
     <w:pPr>
       <w:pStyle w:val="Footer"/>
@@ -2131,13 +3290,45 @@
       </w:rPr>
       <w:t xml:space="preserve">Heart Disease MLOps Pipeline  •  Page </w:t>
     </w:r>
-    <w:fldSimple w:instr="PAGE"/>
+    <w:fldSimple w:instr="PAGE">
+      <w:r>
+        <w:rPr>
+          <w:noProof/>
+        </w:rPr>
+        <w:t>17</w:t>
+      </w:r>
+    </w:fldSimple>
   </w:p>
 </w:ftr>
 </file>
 
+<file path=word/footnotes.xml><?xml version="1.0" encoding="utf-8"?>
+<w:footnotes xmlns:ve="http://schemas.openxmlformats.org/markup-compatibility/2006" xmlns:o="urn:schemas-microsoft-com:office:office" xmlns:r="http://schemas.openxmlformats.org/officeDocument/2006/relationships" xmlns:m="http://schemas.openxmlformats.org/officeDocument/2006/math" xmlns:v="urn:schemas-microsoft-com:vml" xmlns:wp="http://schemas.openxmlformats.org/drawingml/2006/wordprocessingDrawing" xmlns:w10="urn:schemas-microsoft-com:office:word" xmlns:w="http://schemas.openxmlformats.org/wordprocessingml/2006/main" xmlns:wne="http://schemas.microsoft.com/office/word/2006/wordml">
+  <w:footnote w:type="separator" w:id="0">
+    <w:p>
+      <w:pPr>
+        <w:spacing w:after="0" w:line="240" w:lineRule="auto"/>
+      </w:pPr>
+      <w:r>
+        <w:separator/>
+      </w:r>
+    </w:p>
+  </w:footnote>
+  <w:footnote w:type="continuationSeparator" w:id="1">
+    <w:p>
+      <w:pPr>
+        <w:spacing w:after="0" w:line="240" w:lineRule="auto"/>
+      </w:pPr>
+      <w:r>
+        <w:continuationSeparator/>
+      </w:r>
+    </w:p>
+  </w:footnote>
+</w:footnotes>
+</file>
+
 <file path=word/header1.xml><?xml version="1.0" encoding="utf-8"?>
-<w:hdr xmlns:m="http://schemas.openxmlformats.org/officeDocument/2006/math" xmlns:mc="http://schemas.openxmlformats.org/markup-compatibility/2006" xmlns:mo="http://schemas.microsoft.com/office/mac/office/2008/main" xmlns:mv="urn:schemas-microsoft-com:mac:vml" xmlns:o="urn:schemas-microsoft-com:office:office" xmlns:r="http://schemas.openxmlformats.org/officeDocument/2006/relationships" xmlns:v="urn:schemas-microsoft-com:vml" xmlns:w10="urn:schemas-microsoft-com:office:word" xmlns:w14="http://schemas.microsoft.com/office/word/2010/wordml" xmlns:w="http://schemas.openxmlformats.org/wordprocessingml/2006/main" xmlns:wne="http://schemas.microsoft.com/office/word/2006/wordml" xmlns:wp14="http://schemas.microsoft.com/office/word/2010/wordprocessingDrawing" xmlns:wp="http://schemas.openxmlformats.org/drawingml/2006/wordprocessingDrawing" xmlns:wpc="http://schemas.microsoft.com/office/word/2010/wordprocessingCanvas" xmlns:wpg="http://schemas.microsoft.com/office/word/2010/wordprocessingGroup" xmlns:wpi="http://schemas.microsoft.com/office/word/2010/wordprocessingInk" xmlns:wps="http://schemas.microsoft.com/office/word/2010/wordprocessingShape" mc:Ignorable="w14 wp14">
+<w:hdr xmlns:ve="http://schemas.openxmlformats.org/markup-compatibility/2006" xmlns:o="urn:schemas-microsoft-com:office:office" xmlns:r="http://schemas.openxmlformats.org/officeDocument/2006/relationships" xmlns:m="http://schemas.openxmlformats.org/officeDocument/2006/math" xmlns:v="urn:schemas-microsoft-com:vml" xmlns:wp="http://schemas.openxmlformats.org/drawingml/2006/wordprocessingDrawing" xmlns:w10="urn:schemas-microsoft-com:office:word" xmlns:w="http://schemas.openxmlformats.org/wordprocessingml/2006/main" xmlns:wne="http://schemas.microsoft.com/office/word/2006/wordml">
   <w:p>
     <w:pPr>
       <w:pStyle w:val="Header"/>
@@ -2155,7 +3346,7 @@
 </file>
 
 <file path=word/numbering.xml><?xml version="1.0" encoding="utf-8"?>
-<w:numbering xmlns:wpc="http://schemas.microsoft.com/office/word/2010/wordprocessingCanvas" xmlns:mo="http://schemas.microsoft.com/office/mac/office/2008/main" xmlns:mc="http://schemas.openxmlformats.org/markup-compatibility/2006" xmlns:mv="urn:schemas-microsoft-com:mac:vml" xmlns:o="urn:schemas-microsoft-com:office:office" xmlns:r="http://schemas.openxmlformats.org/officeDocument/2006/relationships" xmlns:m="http://schemas.openxmlformats.org/officeDocument/2006/math" xmlns:v="urn:schemas-microsoft-com:vml" xmlns:wp14="http://schemas.microsoft.com/office/word/2010/wordprocessingDrawing" xmlns:wp="http://schemas.openxmlformats.org/drawingml/2006/wordprocessingDrawing" xmlns:w10="urn:schemas-microsoft-com:office:word" xmlns:w="http://schemas.openxmlformats.org/wordprocessingml/2006/main" xmlns:w14="http://schemas.microsoft.com/office/word/2010/wordml" xmlns:wpg="http://schemas.microsoft.com/office/word/2010/wordprocessingGroup" xmlns:wpi="http://schemas.microsoft.com/office/word/2010/wordprocessingInk" xmlns:wne="http://schemas.microsoft.com/office/word/2006/wordml" xmlns:wps="http://schemas.microsoft.com/office/word/2010/wordprocessingShape" mc:Ignorable="w14 wp14">
+<w:numbering xmlns:ve="http://schemas.openxmlformats.org/markup-compatibility/2006" xmlns:o="urn:schemas-microsoft-com:office:office" xmlns:r="http://schemas.openxmlformats.org/officeDocument/2006/relationships" xmlns:m="http://schemas.openxmlformats.org/officeDocument/2006/math" xmlns:v="urn:schemas-microsoft-com:vml" xmlns:wp="http://schemas.openxmlformats.org/drawingml/2006/wordprocessingDrawing" xmlns:w10="urn:schemas-microsoft-com:office:word" xmlns:w="http://schemas.openxmlformats.org/wordprocessingml/2006/main" xmlns:wne="http://schemas.microsoft.com/office/word/2006/wordml">
   <w:abstractNum w:abstractNumId="0">
     <w:nsid w:val="FFFFFF7C"/>
     <w:multiLevelType w:val="singleLevel"/>
@@ -2358,7 +3549,7 @@
 </file>
 
 <file path=word/styles.xml><?xml version="1.0" encoding="utf-8"?>
-<w:styles xmlns:mc="http://schemas.openxmlformats.org/markup-compatibility/2006" xmlns:r="http://schemas.openxmlformats.org/officeDocument/2006/relationships" xmlns:w="http://schemas.openxmlformats.org/wordprocessingml/2006/main" xmlns:w14="http://schemas.microsoft.com/office/word/2010/wordml" mc:Ignorable="w14">
+<w:styles xmlns:r="http://schemas.openxmlformats.org/officeDocument/2006/relationships" xmlns:w="http://schemas.openxmlformats.org/wordprocessingml/2006/main">
   <w:docDefaults>
     <w:rPrDefault>
       <w:rPr>
@@ -2374,7 +3565,7 @@
       </w:pPr>
     </w:pPrDefault>
   </w:docDefaults>
-  <w:latentStyles w:defLockedState="0" w:defUIPriority="99" w:defSemiHidden="1" w:defUnhideWhenUsed="1" w:defQFormat="0" w:count="276">
+  <w:latentStyles w:defLockedState="0" w:defUIPriority="99" w:defSemiHidden="1" w:defUnhideWhenUsed="1" w:defQFormat="0" w:count="267">
     <w:lsdException w:name="Normal" w:semiHidden="0" w:uiPriority="0" w:unhideWhenUsed="0" w:qFormat="1"/>
     <w:lsdException w:name="heading 1" w:semiHidden="0" w:uiPriority="9" w:unhideWhenUsed="0" w:qFormat="1"/>
     <w:lsdException w:name="heading 2" w:uiPriority="9" w:qFormat="1"/>
@@ -2525,50 +3716,6 @@
       <w:sz w:val="18"/>
     </w:rPr>
   </w:style>
-  <w:style w:type="paragraph" w:styleId="Header">
-    <w:name w:val="header"/>
-    <w:basedOn w:val="Normal"/>
-    <w:link w:val="HeaderChar"/>
-    <w:uiPriority w:val="99"/>
-    <w:unhideWhenUsed/>
-    <w:rsid w:val="00E618BF"/>
-    <w:pPr>
-      <w:tabs>
-        <w:tab w:val="center" w:pos="4680"/>
-        <w:tab w:val="right" w:pos="9360"/>
-      </w:tabs>
-      <w:spacing w:after="0" w:line="240" w:lineRule="auto"/>
-    </w:pPr>
-  </w:style>
-  <w:style w:type="character" w:customStyle="1" w:styleId="HeaderChar">
-    <w:name w:val="Header Char"/>
-    <w:basedOn w:val="DefaultParagraphFont"/>
-    <w:link w:val="Header"/>
-    <w:uiPriority w:val="99"/>
-    <w:rsid w:val="00E618BF"/>
-  </w:style>
-  <w:style w:type="paragraph" w:styleId="Footer">
-    <w:name w:val="footer"/>
-    <w:basedOn w:val="Normal"/>
-    <w:link w:val="FooterChar"/>
-    <w:uiPriority w:val="99"/>
-    <w:unhideWhenUsed/>
-    <w:rsid w:val="00E618BF"/>
-    <w:pPr>
-      <w:tabs>
-        <w:tab w:val="center" w:pos="4680"/>
-        <w:tab w:val="right" w:pos="9360"/>
-      </w:tabs>
-      <w:spacing w:after="0" w:line="240" w:lineRule="auto"/>
-    </w:pPr>
-  </w:style>
-  <w:style w:type="character" w:customStyle="1" w:styleId="FooterChar">
-    <w:name w:val="Footer Char"/>
-    <w:basedOn w:val="DefaultParagraphFont"/>
-    <w:link w:val="Footer"/>
-    <w:uiPriority w:val="99"/>
-    <w:rsid w:val="00E618BF"/>
-  </w:style>
   <w:style w:type="paragraph" w:styleId="Heading1">
     <w:name w:val="heading 1"/>
     <w:basedOn w:val="Normal"/>
@@ -2584,7 +3731,7 @@
       <w:outlineLvl w:val="0"/>
     </w:pPr>
     <w:rPr>
-      <w:rFonts w:asciiTheme="majorHAnsi" w:eastAsiaTheme="majorEastAsia" w:hAnsiTheme="majorHAnsi" w:cstheme="majorBidi" w:ascii="Aptos Display" w:hAnsi="Aptos Display"/>
+      <w:rFonts w:asciiTheme="majorHAnsi" w:eastAsiaTheme="majorEastAsia" w:hAnsiTheme="majorHAnsi" w:cstheme="majorBidi"/>
       <w:b/>
       <w:bCs/>
       <w:color w:val="1F4E79"/>
@@ -2608,7 +3755,7 @@
       <w:outlineLvl w:val="1"/>
     </w:pPr>
     <w:rPr>
-      <w:rFonts w:asciiTheme="majorHAnsi" w:eastAsiaTheme="majorEastAsia" w:hAnsiTheme="majorHAnsi" w:cstheme="majorBidi" w:ascii="Aptos Display" w:hAnsi="Aptos Display"/>
+      <w:rFonts w:asciiTheme="majorHAnsi" w:eastAsiaTheme="majorEastAsia" w:hAnsiTheme="majorHAnsi" w:cstheme="majorBidi"/>
       <w:b/>
       <w:bCs/>
       <w:color w:val="1F4E79"/>
@@ -2789,6 +3936,7 @@
     <w:uiPriority w:val="99"/>
     <w:semiHidden/>
     <w:unhideWhenUsed/>
+    <w:qFormat/>
     <w:tblPr>
       <w:tblInd w:w="0" w:type="dxa"/>
       <w:tblCellMar>
@@ -2804,6 +3952,50 @@
     <w:uiPriority w:val="99"/>
     <w:semiHidden/>
     <w:unhideWhenUsed/>
+  </w:style>
+  <w:style w:type="paragraph" w:styleId="Header">
+    <w:name w:val="header"/>
+    <w:basedOn w:val="Normal"/>
+    <w:link w:val="HeaderChar"/>
+    <w:uiPriority w:val="99"/>
+    <w:unhideWhenUsed/>
+    <w:rsid w:val="00E618BF"/>
+    <w:pPr>
+      <w:tabs>
+        <w:tab w:val="center" w:pos="4680"/>
+        <w:tab w:val="right" w:pos="9360"/>
+      </w:tabs>
+      <w:spacing w:after="0" w:line="240" w:lineRule="auto"/>
+    </w:pPr>
+  </w:style>
+  <w:style w:type="character" w:customStyle="1" w:styleId="HeaderChar">
+    <w:name w:val="Header Char"/>
+    <w:basedOn w:val="DefaultParagraphFont"/>
+    <w:link w:val="Header"/>
+    <w:uiPriority w:val="99"/>
+    <w:rsid w:val="00E618BF"/>
+  </w:style>
+  <w:style w:type="paragraph" w:styleId="Footer">
+    <w:name w:val="footer"/>
+    <w:basedOn w:val="Normal"/>
+    <w:link w:val="FooterChar"/>
+    <w:uiPriority w:val="99"/>
+    <w:unhideWhenUsed/>
+    <w:rsid w:val="00E618BF"/>
+    <w:pPr>
+      <w:tabs>
+        <w:tab w:val="center" w:pos="4680"/>
+        <w:tab w:val="right" w:pos="9360"/>
+      </w:tabs>
+      <w:spacing w:after="0" w:line="240" w:lineRule="auto"/>
+    </w:pPr>
+  </w:style>
+  <w:style w:type="character" w:customStyle="1" w:styleId="FooterChar">
+    <w:name w:val="Footer Char"/>
+    <w:basedOn w:val="DefaultParagraphFont"/>
+    <w:link w:val="Footer"/>
+    <w:uiPriority w:val="99"/>
+    <w:rsid w:val="00E618BF"/>
   </w:style>
   <w:style w:type="paragraph" w:styleId="NoSpacing">
     <w:name w:val="No Spacing"/>
@@ -2873,7 +4065,7 @@
       <w:contextualSpacing/>
     </w:pPr>
     <w:rPr>
-      <w:rFonts w:asciiTheme="majorHAnsi" w:eastAsiaTheme="majorEastAsia" w:hAnsiTheme="majorHAnsi" w:cstheme="majorBidi" w:ascii="Aptos Display" w:hAnsi="Aptos Display"/>
+      <w:rFonts w:asciiTheme="majorHAnsi" w:eastAsiaTheme="majorEastAsia" w:hAnsiTheme="majorHAnsi" w:cstheme="majorBidi"/>
       <w:b/>
       <w:color w:val="1F4E79"/>
       <w:spacing w:val="5"/>
@@ -3319,7 +4511,6 @@
       <w:b/>
       <w:bCs/>
       <w:color w:val="4F81BD" w:themeColor="accent1"/>
-      <w:sz w:val="18"/>
       <w:szCs w:val="18"/>
     </w:rPr>
   </w:style>
@@ -3487,8 +4678,8 @@
       </w:tblCellMar>
     </w:tblPr>
   </w:style>
-  <w:style w:type="table" w:styleId="LightShading">
-    <w:name w:val="Light Shading"/>
+  <w:style w:type="table" w:customStyle="1" w:styleId="LightShading1">
+    <w:name w:val="Light Shading1"/>
     <w:basedOn w:val="TableNormal"/>
     <w:uiPriority w:val="60"/>
     <w:rsid w:val="00FC693F"/>
@@ -3590,8 +4781,8 @@
       </w:tcPr>
     </w:tblStylePr>
   </w:style>
-  <w:style w:type="table" w:styleId="LightShading-Accent1">
-    <w:name w:val="Light Shading Accent 1"/>
+  <w:style w:type="table" w:customStyle="1" w:styleId="LightShading-Accent11">
+    <w:name w:val="Light Shading - Accent 11"/>
     <w:basedOn w:val="TableNormal"/>
     <w:uiPriority w:val="60"/>
     <w:rsid w:val="00FC693F"/>
@@ -4208,8 +5399,8 @@
       </w:tcPr>
     </w:tblStylePr>
   </w:style>
-  <w:style w:type="table" w:styleId="LightList">
-    <w:name w:val="Light List"/>
+  <w:style w:type="table" w:customStyle="1" w:styleId="LightList1">
+    <w:name w:val="Light List1"/>
     <w:basedOn w:val="TableNormal"/>
     <w:uiPriority w:val="61"/>
     <w:rsid w:val="00FC693F"/>
@@ -4300,8 +5491,8 @@
       </w:tcPr>
     </w:tblStylePr>
   </w:style>
-  <w:style w:type="table" w:styleId="LightList-Accent1">
-    <w:name w:val="Light List Accent 1"/>
+  <w:style w:type="table" w:customStyle="1" w:styleId="LightList-Accent11">
+    <w:name w:val="Light List - Accent 11"/>
     <w:basedOn w:val="TableNormal"/>
     <w:uiPriority w:val="61"/>
     <w:rsid w:val="00FC693F"/>
@@ -4852,8 +6043,8 @@
       </w:tcPr>
     </w:tblStylePr>
   </w:style>
-  <w:style w:type="table" w:styleId="LightGrid">
-    <w:name w:val="Light Grid"/>
+  <w:style w:type="table" w:customStyle="1" w:styleId="LightGrid1">
+    <w:name w:val="Light Grid1"/>
     <w:basedOn w:val="TableNormal"/>
     <w:uiPriority w:val="62"/>
     <w:rsid w:val="00CB0664"/>
@@ -4982,8 +6173,8 @@
       </w:tcPr>
     </w:tblStylePr>
   </w:style>
-  <w:style w:type="table" w:styleId="LightGrid-Accent1">
-    <w:name w:val="Light Grid Accent 1"/>
+  <w:style w:type="table" w:customStyle="1" w:styleId="LightGrid-Accent11">
+    <w:name w:val="Light Grid - Accent 11"/>
     <w:basedOn w:val="TableNormal"/>
     <w:uiPriority w:val="62"/>
     <w:rsid w:val="00CB0664"/>
@@ -5762,8 +6953,8 @@
       </w:tcPr>
     </w:tblStylePr>
   </w:style>
-  <w:style w:type="table" w:styleId="MediumShading1">
-    <w:name w:val="Medium Shading 1"/>
+  <w:style w:type="table" w:customStyle="1" w:styleId="MediumShading11">
+    <w:name w:val="Medium Shading 11"/>
     <w:basedOn w:val="TableNormal"/>
     <w:uiPriority w:val="63"/>
     <w:rsid w:val="00CB0664"/>
@@ -5868,8 +7059,8 @@
       </w:tcPr>
     </w:tblStylePr>
   </w:style>
-  <w:style w:type="table" w:styleId="MediumShading1-Accent1">
-    <w:name w:val="Medium Shading 1 Accent 1"/>
+  <w:style w:type="table" w:customStyle="1" w:styleId="MediumShading1-Accent11">
+    <w:name w:val="Medium Shading 1 - Accent 11"/>
     <w:basedOn w:val="TableNormal"/>
     <w:uiPriority w:val="63"/>
     <w:rsid w:val="00CB0664"/>
@@ -6504,8 +7695,8 @@
       </w:tcPr>
     </w:tblStylePr>
   </w:style>
-  <w:style w:type="table" w:styleId="MediumShading2">
-    <w:name w:val="Medium Shading 2"/>
+  <w:style w:type="table" w:customStyle="1" w:styleId="MediumShading21">
+    <w:name w:val="Medium Shading 21"/>
     <w:basedOn w:val="TableNormal"/>
     <w:uiPriority w:val="64"/>
     <w:rsid w:val="00CB0664"/>
@@ -6653,8 +7844,8 @@
       </w:tcPr>
     </w:tblStylePr>
   </w:style>
-  <w:style w:type="table" w:styleId="MediumShading2-Accent1">
-    <w:name w:val="Medium Shading 2 Accent 1"/>
+  <w:style w:type="table" w:customStyle="1" w:styleId="MediumShading2-Accent11">
+    <w:name w:val="Medium Shading 2 - Accent 11"/>
     <w:basedOn w:val="TableNormal"/>
     <w:uiPriority w:val="64"/>
     <w:rsid w:val="00CB0664"/>
@@ -7547,8 +8738,8 @@
       </w:tcPr>
     </w:tblStylePr>
   </w:style>
-  <w:style w:type="table" w:styleId="MediumList1">
-    <w:name w:val="Medium List 1"/>
+  <w:style w:type="table" w:customStyle="1" w:styleId="MediumList11">
+    <w:name w:val="Medium List 11"/>
     <w:basedOn w:val="TableNormal"/>
     <w:uiPriority w:val="65"/>
     <w:rsid w:val="00CB0664"/>
@@ -7631,8 +8822,8 @@
       </w:tcPr>
     </w:tblStylePr>
   </w:style>
-  <w:style w:type="table" w:styleId="MediumList1-Accent1">
-    <w:name w:val="Medium List 1 Accent 1"/>
+  <w:style w:type="table" w:customStyle="1" w:styleId="MediumList1-Accent11">
+    <w:name w:val="Medium List 1 - Accent 11"/>
     <w:basedOn w:val="TableNormal"/>
     <w:uiPriority w:val="65"/>
     <w:rsid w:val="00CB0664"/>
@@ -8135,8 +9326,8 @@
       </w:tcPr>
     </w:tblStylePr>
   </w:style>
-  <w:style w:type="table" w:styleId="MediumList2">
-    <w:name w:val="Medium List 2"/>
+  <w:style w:type="table" w:customStyle="1" w:styleId="MediumList21">
+    <w:name w:val="Medium List 21"/>
     <w:basedOn w:val="TableNormal"/>
     <w:uiPriority w:val="66"/>
     <w:rsid w:val="00CB0664"/>
@@ -9031,8 +10222,8 @@
       </w:tcPr>
     </w:tblStylePr>
   </w:style>
-  <w:style w:type="table" w:styleId="MediumGrid1">
-    <w:name w:val="Medium Grid 1"/>
+  <w:style w:type="table" w:customStyle="1" w:styleId="MediumGrid11">
+    <w:name w:val="Medium Grid 11"/>
     <w:basedOn w:val="TableNormal"/>
     <w:uiPriority w:val="67"/>
     <w:rsid w:val="00CB0664"/>
@@ -9542,8 +10733,8 @@
       </w:tcPr>
     </w:tblStylePr>
   </w:style>
-  <w:style w:type="table" w:styleId="MediumGrid2">
-    <w:name w:val="Medium Grid 2"/>
+  <w:style w:type="table" w:customStyle="1" w:styleId="MediumGrid21">
+    <w:name w:val="Medium Grid 21"/>
     <w:basedOn w:val="TableNormal"/>
     <w:uiPriority w:val="68"/>
     <w:rsid w:val="00CB0664"/>
@@ -10417,8 +11608,8 @@
       </w:tcPr>
     </w:tblStylePr>
   </w:style>
-  <w:style w:type="table" w:styleId="MediumGrid3">
-    <w:name w:val="Medium Grid 3"/>
+  <w:style w:type="table" w:customStyle="1" w:styleId="MediumGrid31">
+    <w:name w:val="Medium Grid 31"/>
     <w:basedOn w:val="TableNormal"/>
     <w:uiPriority w:val="69"/>
     <w:rsid w:val="00CB0664"/>
@@ -11404,8 +12595,8 @@
       </w:tcPr>
     </w:tblStylePr>
   </w:style>
-  <w:style w:type="table" w:styleId="DarkList">
-    <w:name w:val="Dark List"/>
+  <w:style w:type="table" w:customStyle="1" w:styleId="DarkList1">
+    <w:name w:val="Dark List1"/>
     <w:basedOn w:val="TableNormal"/>
     <w:uiPriority w:val="70"/>
     <w:rsid w:val="00CB0664"/>
@@ -12202,8 +13393,8 @@
       </w:tcPr>
     </w:tblStylePr>
   </w:style>
-  <w:style w:type="table" w:styleId="ColorfulShading">
-    <w:name w:val="Colorful Shading"/>
+  <w:style w:type="table" w:customStyle="1" w:styleId="ColorfulShading1">
+    <w:name w:val="Colorful Shading1"/>
     <w:basedOn w:val="TableNormal"/>
     <w:uiPriority w:val="71"/>
     <w:rsid w:val="00CB0664"/>
@@ -13046,8 +14237,8 @@
       </w:rPr>
     </w:tblStylePr>
   </w:style>
-  <w:style w:type="table" w:styleId="ColorfulList">
-    <w:name w:val="Colorful List"/>
+  <w:style w:type="table" w:customStyle="1" w:styleId="ColorfulList1">
+    <w:name w:val="Colorful List1"/>
     <w:basedOn w:val="TableNormal"/>
     <w:uiPriority w:val="72"/>
     <w:rsid w:val="00CB0664"/>
@@ -13648,8 +14839,8 @@
       </w:tcPr>
     </w:tblStylePr>
   </w:style>
-  <w:style w:type="table" w:styleId="ColorfulGrid">
-    <w:name w:val="Colorful Grid"/>
+  <w:style w:type="table" w:customStyle="1" w:styleId="ColorfulGrid1">
+    <w:name w:val="Colorful Grid1"/>
     <w:basedOn w:val="TableNormal"/>
     <w:uiPriority w:val="73"/>
     <w:rsid w:val="00CB0664"/>
@@ -14207,6 +15398,36 @@
         <w:shd w:val="clear" w:color="auto" w:fill="FBCAA2" w:themeFill="accent6" w:themeFillTint="7F"/>
       </w:tcPr>
     </w:tblStylePr>
+  </w:style>
+  <w:style w:type="paragraph" w:styleId="BalloonText">
+    <w:name w:val="Balloon Text"/>
+    <w:basedOn w:val="Normal"/>
+    <w:link w:val="BalloonTextChar"/>
+    <w:uiPriority w:val="99"/>
+    <w:semiHidden/>
+    <w:unhideWhenUsed/>
+    <w:rsid w:val="005C6135"/>
+    <w:pPr>
+      <w:spacing w:after="0" w:line="240" w:lineRule="auto"/>
+    </w:pPr>
+    <w:rPr>
+      <w:rFonts w:ascii="Tahoma" w:hAnsi="Tahoma" w:cs="Tahoma"/>
+      <w:sz w:val="16"/>
+      <w:szCs w:val="16"/>
+    </w:rPr>
+  </w:style>
+  <w:style w:type="character" w:customStyle="1" w:styleId="BalloonTextChar">
+    <w:name w:val="Balloon Text Char"/>
+    <w:basedOn w:val="DefaultParagraphFont"/>
+    <w:link w:val="BalloonText"/>
+    <w:uiPriority w:val="99"/>
+    <w:semiHidden/>
+    <w:rsid w:val="005C6135"/>
+    <w:rPr>
+      <w:rFonts w:ascii="Tahoma" w:hAnsi="Tahoma" w:cs="Tahoma"/>
+      <w:sz w:val="16"/>
+      <w:szCs w:val="16"/>
+    </w:rPr>
   </w:style>
 </w:styles>
 </file>

</xml_diff>